<commit_message>
experiments: regenerate_figures, ajustes runners A/B/C y balance | memoria TFM | sesion 11
</commit_message>
<xml_diff>
--- a/CARPETA COMPARTIDA TUTOR/15MUIN TFM MOYA MARIN SERGIO.docx
+++ b/CARPETA COMPARTIDA TUTOR/15MUIN TFM MOYA MARIN SERGIO.docx
@@ -234,14 +234,14 @@
                 <w:rFonts w:ascii="Arial" w:hAnsi="Arial"/>
                 <w:color w:val="FFFFFF" w:themeColor="background1"/>
               </w:rPr>
-              <w:t xml:space="preserve">Curso académico </w:t>
+              <w:t>Curso académico</w:t>
             </w:r>
             <w:r>
               <w:rPr>
                 <w:rFonts w:ascii="Arial" w:hAnsi="Arial"/>
                 <w:color w:val="FFFFFF" w:themeColor="background1"/>
               </w:rPr>
-              <w:t>2025-2026</w:t>
+              <w:t>:</w:t>
             </w:r>
           </w:p>
           <w:p>
@@ -257,7 +257,28 @@
                 <w:rFonts w:ascii="Arial" w:hAnsi="Arial"/>
                 <w:color w:val="FFFFFF" w:themeColor="background1"/>
               </w:rPr>
-              <w:t>202X – 202X</w:t>
+              <w:t>202</w:t>
+            </w:r>
+            <w:r>
+              <w:rPr>
+                <w:rFonts w:ascii="Arial" w:hAnsi="Arial"/>
+                <w:color w:val="FFFFFF" w:themeColor="background1"/>
+              </w:rPr>
+              <w:t>5</w:t>
+            </w:r>
+            <w:r>
+              <w:rPr>
+                <w:rFonts w:ascii="Arial" w:hAnsi="Arial"/>
+                <w:color w:val="FFFFFF" w:themeColor="background1"/>
+              </w:rPr>
+              <w:t xml:space="preserve"> – 202</w:t>
+            </w:r>
+            <w:r>
+              <w:rPr>
+                <w:rFonts w:ascii="Arial" w:hAnsi="Arial"/>
+                <w:color w:val="FFFFFF" w:themeColor="background1"/>
+              </w:rPr>
+              <w:t>6</w:t>
             </w:r>
           </w:p>
         </w:tc>
@@ -362,7 +383,23 @@
                 <w:rFonts w:ascii="Arial" w:hAnsi="Arial"/>
                 <w:color w:val="FFFFFF" w:themeColor="background1"/>
               </w:rPr>
-              <w:t>: XXXX</w:t>
+              <w:t xml:space="preserve">: </w:t>
+            </w:r>
+          </w:p>
+          <w:p>
+            <w:pPr>
+              <w:spacing w:line="240" w:lineRule="auto"/>
+              <w:rPr>
+                <w:rFonts w:ascii="Arial" w:hAnsi="Arial"/>
+                <w:color w:val="FFFFFF" w:themeColor="background1"/>
+              </w:rPr>
+            </w:pPr>
+            <w:r>
+              <w:rPr>
+                <w:rFonts w:ascii="Arial" w:hAnsi="Arial"/>
+                <w:color w:val="FFFFFF" w:themeColor="background1"/>
+              </w:rPr>
+              <w:t>BADY PATRICIO GANA CASTILLO</w:t>
             </w:r>
           </w:p>
         </w:tc>
@@ -7136,6 +7173,68 @@
       </w:pPr>
       <w:r>
         <w:rPr>
+          <w:noProof/>
+        </w:rPr>
+        <w:drawing>
+          <wp:inline distT="0" distB="0" distL="0" distR="0" wp14:anchorId="4985EB03" wp14:editId="5200D798">
+            <wp:extent cx="5400040" cy="2440305"/>
+            <wp:effectExtent l="0" t="0" r="0" b="0"/>
+            <wp:docPr id="802765877" name="Imagen 1" descr="alt text"/>
+            <wp:cNvGraphicFramePr>
+              <a:graphicFrameLocks xmlns:a="http://schemas.openxmlformats.org/drawingml/2006/main" noChangeAspect="1"/>
+            </wp:cNvGraphicFramePr>
+            <a:graphic xmlns:a="http://schemas.openxmlformats.org/drawingml/2006/main">
+              <a:graphicData uri="http://schemas.openxmlformats.org/drawingml/2006/picture">
+                <pic:pic xmlns:pic="http://schemas.openxmlformats.org/drawingml/2006/picture">
+                  <pic:nvPicPr>
+                    <pic:cNvPr id="0" name="Picture 5" descr="alt text"/>
+                    <pic:cNvPicPr>
+                      <a:picLocks noChangeAspect="1" noChangeArrowheads="1"/>
+                    </pic:cNvPicPr>
+                  </pic:nvPicPr>
+                  <pic:blipFill>
+                    <a:blip r:embed="rId16">
+                      <a:extLst>
+                        <a:ext uri="{28A0092B-C50C-407E-A947-70E740481C1C}">
+                          <a14:useLocalDpi xmlns:a14="http://schemas.microsoft.com/office/drawing/2010/main" val="0"/>
+                        </a:ext>
+                      </a:extLst>
+                    </a:blip>
+                    <a:srcRect/>
+                    <a:stretch>
+                      <a:fillRect/>
+                    </a:stretch>
+                  </pic:blipFill>
+                  <pic:spPr bwMode="auto">
+                    <a:xfrm>
+                      <a:off x="0" y="0"/>
+                      <a:ext cx="5400040" cy="2440305"/>
+                    </a:xfrm>
+                    <a:prstGeom prst="rect">
+                      <a:avLst/>
+                    </a:prstGeom>
+                    <a:noFill/>
+                    <a:ln>
+                      <a:noFill/>
+                    </a:ln>
+                  </pic:spPr>
+                </pic:pic>
+              </a:graphicData>
+            </a:graphic>
+          </wp:inline>
+        </w:drawing>
+      </w:r>
+    </w:p>
+    <w:p>
+      <w:pPr>
+        <w:spacing w:line="240" w:lineRule="auto"/>
+        <w:rPr>
+          <w:rFonts w:ascii="Arial" w:hAnsi="Arial"/>
+          <w:lang w:eastAsia="es-ES"/>
+        </w:rPr>
+      </w:pPr>
+      <w:r>
+        <w:rPr>
           <w:rFonts w:ascii="Arial" w:hAnsi="Arial"/>
           <w:lang w:eastAsia="es-ES"/>
         </w:rPr>
@@ -7171,6 +7270,7 @@
           <w:rFonts w:ascii="Arial" w:hAnsi="Arial"/>
           <w:lang w:eastAsia="es-ES"/>
         </w:rPr>
+        <w:lastRenderedPageBreak/>
         <w:t>Para paliar este desequilibrio, gran parte de la literatura científica reciente ha centrado sus esfuerzos en la generación masiva de datos sintéticos y en el despliegue de arquitecturas de aprendizaje profundo (</w:t>
       </w:r>
       <w:r>
@@ -7288,15 +7388,7 @@
           <w:rFonts w:ascii="Arial" w:hAnsi="Arial"/>
           <w:lang w:eastAsia="es-ES"/>
         </w:rPr>
-        <w:t xml:space="preserve">) derivadas de una validación temporal defectuosa (como el uso de particiones aleatorias que mezclan el futuro con el pasado) o de la inyección global de ruido sintético previo a la división de </w:t>
-      </w:r>
-      <w:r>
-        <w:rPr>
-          <w:rFonts w:ascii="Arial" w:hAnsi="Arial"/>
-          <w:lang w:eastAsia="es-ES"/>
-        </w:rPr>
-        <w:lastRenderedPageBreak/>
-        <w:t>los datos, lo que permite al modelo memorizar vectores de ataque en lugar de generalizarlos (Hayat &amp; Magnier, 2025).</w:t>
+        <w:t>) derivadas de una validación temporal defectuosa (como el uso de particiones aleatorias que mezclan el futuro con el pasado) o de la inyección global de ruido sintético previo a la división de los datos, lo que permite al modelo memorizar vectores de ataque en lugar de generalizarlos (Hayat &amp; Magnier, 2025).</w:t>
       </w:r>
     </w:p>
     <w:p>
@@ -7435,6 +7527,7 @@
           <w:b/>
           <w:bCs/>
         </w:rPr>
+        <w:lastRenderedPageBreak/>
         <w:t>P</w:t>
       </w:r>
       <w:r>
@@ -7603,14 +7696,7 @@
         <w:rPr>
           <w:rFonts w:ascii="Arial" w:hAnsi="Arial"/>
         </w:rPr>
-        <w:t xml:space="preserve"> para la detección de fraude en tarjetas de crédito, que resuelva la ineficiencia operativa del desbalance extremo de clases, cuantifique matemáticamente el sesgo de las </w:t>
-      </w:r>
-      <w:r>
-        <w:rPr>
-          <w:rFonts w:ascii="Arial" w:hAnsi="Arial"/>
-        </w:rPr>
-        <w:lastRenderedPageBreak/>
-        <w:t>evaluaciones tradicionales (</w:t>
+        <w:t xml:space="preserve"> para la detección de fraude en tarjetas de crédito, que resuelva la ineficiencia operativa del desbalance extremo de clases, cuantifique matemáticamente el sesgo de las evaluaciones tradicionales (</w:t>
       </w:r>
       <w:r>
         <w:rPr>
@@ -7948,6 +8034,7 @@
           <w:b/>
           <w:bCs/>
         </w:rPr>
+        <w:lastRenderedPageBreak/>
         <w:t>H</w:t>
       </w:r>
       <w:r>
@@ -8132,7 +8219,6 @@
           <w:b/>
           <w:bCs/>
         </w:rPr>
-        <w:lastRenderedPageBreak/>
         <w:t>H</w:t>
       </w:r>
       <w:r>
@@ -8406,6 +8492,7 @@
           <w:b/>
           <w:bCs/>
         </w:rPr>
+        <w:lastRenderedPageBreak/>
         <w:t>Transición hacia la "Caja Blanca" Operativa (Implementación SOC)</w:t>
       </w:r>
       <w:r>
@@ -8638,6 +8725,60 @@
       </w:pPr>
       <w:r>
         <w:rPr>
+          <w:noProof/>
+        </w:rPr>
+        <w:drawing>
+          <wp:inline distT="0" distB="0" distL="0" distR="0" wp14:anchorId="7368D720" wp14:editId="6423D0C6">
+            <wp:extent cx="5400040" cy="3829685"/>
+            <wp:effectExtent l="0" t="0" r="0" b="0"/>
+            <wp:docPr id="715600200" name="Gráfico 1"/>
+            <wp:cNvGraphicFramePr>
+              <a:graphicFrameLocks xmlns:a="http://schemas.openxmlformats.org/drawingml/2006/main" noChangeAspect="1"/>
+            </wp:cNvGraphicFramePr>
+            <a:graphic xmlns:a="http://schemas.openxmlformats.org/drawingml/2006/main">
+              <a:graphicData uri="http://schemas.openxmlformats.org/drawingml/2006/picture">
+                <pic:pic xmlns:pic="http://schemas.openxmlformats.org/drawingml/2006/picture">
+                  <pic:nvPicPr>
+                    <pic:cNvPr id="715600200" name=""/>
+                    <pic:cNvPicPr/>
+                  </pic:nvPicPr>
+                  <pic:blipFill>
+                    <a:blip r:embed="rId17">
+                      <a:extLst>
+                        <a:ext uri="{96DAC541-7B7A-43D3-8B79-37D633B846F1}">
+                          <asvg:svgBlip xmlns:asvg="http://schemas.microsoft.com/office/drawing/2016/SVG/main" r:embed="rId18"/>
+                        </a:ext>
+                      </a:extLst>
+                    </a:blip>
+                    <a:stretch>
+                      <a:fillRect/>
+                    </a:stretch>
+                  </pic:blipFill>
+                  <pic:spPr>
+                    <a:xfrm>
+                      <a:off x="0" y="0"/>
+                      <a:ext cx="5400040" cy="3829685"/>
+                    </a:xfrm>
+                    <a:prstGeom prst="rect">
+                      <a:avLst/>
+                    </a:prstGeom>
+                  </pic:spPr>
+                </pic:pic>
+              </a:graphicData>
+            </a:graphic>
+          </wp:inline>
+        </w:drawing>
+      </w:r>
+    </w:p>
+    <w:p>
+      <w:pPr>
+        <w:spacing w:line="240" w:lineRule="auto"/>
+        <w:rPr>
+          <w:rFonts w:ascii="Arial" w:hAnsi="Arial"/>
+        </w:rPr>
+      </w:pPr>
+      <w:r>
+        <w:rPr>
           <w:rFonts w:ascii="Arial" w:hAnsi="Arial"/>
         </w:rPr>
         <w:t xml:space="preserve">Adicionalmente, el fraude opera en un entorno adversario dinámico sujeto al Concept Drift (cambio de concepto). </w:t>
@@ -8646,13 +8787,82 @@
         <w:rPr>
           <w:rFonts w:ascii="Arial" w:hAnsi="Arial"/>
         </w:rPr>
-        <w:t>Los patrones delictivos no son estacionarios; evolucionan en respuesta a las medidas de seguridad implementadas (Gama et al., 2014). La literatura reciente demuestra que ignorar la cronología de las transacciones en la fase de validación invisibiliza esta evolución temporal del estafador, haciendo obligatorio el abandono de las particiones aleatorias en favor de ventanas de validación prequencial (Lucas et al., 2020; Baesens et al., 2015)</w:t>
+        <w:t xml:space="preserve">Los patrones delictivos no son estacionarios; evolucionan en respuesta a las medidas de seguridad implementadas (Gama et al., 2014). La </w:t>
+      </w:r>
+      <w:r>
+        <w:rPr>
+          <w:rFonts w:ascii="Arial" w:hAnsi="Arial"/>
+        </w:rPr>
+        <w:lastRenderedPageBreak/>
+        <w:t>literatura reciente demuestra que ignorar la cronología de las transacciones en la fase de validación invisibiliza esta evolución temporal del estafador, haciendo obligatorio el abandono de las particiones aleatorias en favor de ventanas de validación prequencial (Lucas et al., 2020; Baesens et al., 2015)</w:t>
       </w:r>
       <w:r>
         <w:rPr>
           <w:rFonts w:ascii="Arial" w:hAnsi="Arial"/>
         </w:rPr>
         <w:t>.</w:t>
+      </w:r>
+    </w:p>
+    <w:p>
+      <w:pPr>
+        <w:spacing w:line="240" w:lineRule="auto"/>
+        <w:jc w:val="center"/>
+        <w:rPr>
+          <w:rFonts w:ascii="Arial" w:hAnsi="Arial"/>
+        </w:rPr>
+      </w:pPr>
+      <w:r>
+        <w:rPr>
+          <w:noProof/>
+        </w:rPr>
+        <w:drawing>
+          <wp:inline distT="0" distB="0" distL="0" distR="0" wp14:anchorId="7566296E" wp14:editId="377AF1AA">
+            <wp:extent cx="4784271" cy="2049518"/>
+            <wp:effectExtent l="0" t="0" r="0" b="8255"/>
+            <wp:docPr id="537155524" name="Imagen 2" descr="Concept Drift Types: A. Sudden Drift B. Gradual Drift C. Incremental Drift D. Recurring Drift"/>
+            <wp:cNvGraphicFramePr>
+              <a:graphicFrameLocks xmlns:a="http://schemas.openxmlformats.org/drawingml/2006/main" noChangeAspect="1"/>
+            </wp:cNvGraphicFramePr>
+            <a:graphic xmlns:a="http://schemas.openxmlformats.org/drawingml/2006/main">
+              <a:graphicData uri="http://schemas.openxmlformats.org/drawingml/2006/picture">
+                <pic:pic xmlns:pic="http://schemas.openxmlformats.org/drawingml/2006/picture">
+                  <pic:nvPicPr>
+                    <pic:cNvPr id="0" name="Picture 7" descr="Concept Drift Types: A. Sudden Drift B. Gradual Drift C. Incremental Drift D. Recurring Drift"/>
+                    <pic:cNvPicPr>
+                      <a:picLocks noChangeAspect="1" noChangeArrowheads="1"/>
+                    </pic:cNvPicPr>
+                  </pic:nvPicPr>
+                  <pic:blipFill>
+                    <a:blip r:embed="rId19">
+                      <a:extLst>
+                        <a:ext uri="{28A0092B-C50C-407E-A947-70E740481C1C}">
+                          <a14:useLocalDpi xmlns:a14="http://schemas.microsoft.com/office/drawing/2010/main" val="0"/>
+                        </a:ext>
+                      </a:extLst>
+                    </a:blip>
+                    <a:srcRect/>
+                    <a:stretch>
+                      <a:fillRect/>
+                    </a:stretch>
+                  </pic:blipFill>
+                  <pic:spPr bwMode="auto">
+                    <a:xfrm>
+                      <a:off x="0" y="0"/>
+                      <a:ext cx="4802482" cy="2057319"/>
+                    </a:xfrm>
+                    <a:prstGeom prst="rect">
+                      <a:avLst/>
+                    </a:prstGeom>
+                    <a:noFill/>
+                    <a:ln>
+                      <a:noFill/>
+                    </a:ln>
+                  </pic:spPr>
+                </pic:pic>
+              </a:graphicData>
+            </a:graphic>
+          </wp:inline>
+        </w:drawing>
       </w:r>
     </w:p>
     <w:p>
@@ -8783,16 +8993,7 @@
           <w:i/>
           <w:iCs/>
         </w:rPr>
-        <w:t xml:space="preserve">Isolation </w:t>
-      </w:r>
-      <w:r>
-        <w:rPr>
-          <w:rFonts w:ascii="Arial" w:hAnsi="Arial"/>
-          <w:i/>
-          <w:iCs/>
-        </w:rPr>
-        <w:lastRenderedPageBreak/>
-        <w:t>Forest</w:t>
+        <w:t>Isolation Forest</w:t>
       </w:r>
       <w:r>
         <w:rPr>
@@ -8891,6 +9092,7 @@
         <w:rPr>
           <w:rFonts w:ascii="Arial" w:hAnsi="Arial"/>
         </w:rPr>
+        <w:lastRenderedPageBreak/>
         <w:t>La Problemática de la Validación y el Data Leakage</w:t>
       </w:r>
       <w:bookmarkEnd w:id="20"/>
@@ -9197,7 +9399,6 @@
         <w:rPr>
           <w:rFonts w:ascii="Arial" w:hAnsi="Arial"/>
         </w:rPr>
-        <w:lastRenderedPageBreak/>
         <w:t>Inteligencia Artificial Explicable (XAI): Superando la Caja Negra</w:t>
       </w:r>
       <w:bookmarkEnd w:id="22"/>
@@ -9347,6 +9548,7 @@
             <w:rPr>
               <w:rFonts w:ascii="Cambria Math" w:hAnsi="Cambria Math"/>
             </w:rPr>
+            <w:lastRenderedPageBreak/>
             <m:t>A f</m:t>
           </m:r>
           <m:d>
@@ -10411,6 +10613,68 @@
       </w:pPr>
       <w:r>
         <w:rPr>
+          <w:noProof/>
+        </w:rPr>
+        <w:drawing>
+          <wp:inline distT="0" distB="0" distL="0" distR="0" wp14:anchorId="74F84694" wp14:editId="4D661BAC">
+            <wp:extent cx="5400040" cy="2023745"/>
+            <wp:effectExtent l="0" t="0" r="0" b="0"/>
+            <wp:docPr id="890028591" name="Imagen 3"/>
+            <wp:cNvGraphicFramePr>
+              <a:graphicFrameLocks xmlns:a="http://schemas.openxmlformats.org/drawingml/2006/main" noChangeAspect="1"/>
+            </wp:cNvGraphicFramePr>
+            <a:graphic xmlns:a="http://schemas.openxmlformats.org/drawingml/2006/main">
+              <a:graphicData uri="http://schemas.openxmlformats.org/drawingml/2006/picture">
+                <pic:pic xmlns:pic="http://schemas.openxmlformats.org/drawingml/2006/picture">
+                  <pic:nvPicPr>
+                    <pic:cNvPr id="0" name="Picture 9"/>
+                    <pic:cNvPicPr>
+                      <a:picLocks noChangeAspect="1" noChangeArrowheads="1"/>
+                    </pic:cNvPicPr>
+                  </pic:nvPicPr>
+                  <pic:blipFill>
+                    <a:blip r:embed="rId20">
+                      <a:extLst>
+                        <a:ext uri="{28A0092B-C50C-407E-A947-70E740481C1C}">
+                          <a14:useLocalDpi xmlns:a14="http://schemas.microsoft.com/office/drawing/2010/main" val="0"/>
+                        </a:ext>
+                      </a:extLst>
+                    </a:blip>
+                    <a:srcRect/>
+                    <a:stretch>
+                      <a:fillRect/>
+                    </a:stretch>
+                  </pic:blipFill>
+                  <pic:spPr bwMode="auto">
+                    <a:xfrm>
+                      <a:off x="0" y="0"/>
+                      <a:ext cx="5400040" cy="2023745"/>
+                    </a:xfrm>
+                    <a:prstGeom prst="rect">
+                      <a:avLst/>
+                    </a:prstGeom>
+                    <a:noFill/>
+                    <a:ln>
+                      <a:noFill/>
+                    </a:ln>
+                  </pic:spPr>
+                </pic:pic>
+              </a:graphicData>
+            </a:graphic>
+          </wp:inline>
+        </w:drawing>
+      </w:r>
+    </w:p>
+    <w:p>
+      <w:pPr>
+        <w:spacing w:line="240" w:lineRule="auto"/>
+        <w:rPr>
+          <w:rFonts w:ascii="Arial" w:hAnsi="Arial"/>
+          <w:lang w:eastAsia="es-ES"/>
+        </w:rPr>
+      </w:pPr>
+      <w:r>
+        <w:rPr>
           <w:rFonts w:ascii="Arial" w:hAnsi="Arial"/>
           <w:lang w:eastAsia="es-ES"/>
         </w:rPr>
@@ -10484,38 +10748,9 @@
       <w:r>
         <w:rPr>
           <w:rFonts w:ascii="Arial" w:eastAsia="Times New Roman" w:hAnsi="Arial"/>
-          <w:b/>
-          <w:bCs/>
           <w:lang w:eastAsia="es-ES"/>
         </w:rPr>
         <w:t>validación cruzada aleatoria (</w:t>
-      </w:r>
-      <w:r>
-        <w:rPr>
-          <w:rFonts w:ascii="Arial" w:eastAsia="Times New Roman" w:hAnsi="Arial"/>
-          <w:b/>
-          <w:bCs/>
-          <w:i/>
-          <w:iCs/>
-          <w:lang w:eastAsia="es-ES"/>
-        </w:rPr>
-        <w:t>Random K-Fold Cross Validation</w:t>
-      </w:r>
-      <w:r>
-        <w:rPr>
-          <w:rFonts w:ascii="Arial" w:eastAsia="Times New Roman" w:hAnsi="Arial"/>
-          <w:b/>
-          <w:bCs/>
-          <w:lang w:eastAsia="es-ES"/>
-        </w:rPr>
-        <w:t>)</w:t>
-      </w:r>
-      <w:r>
-        <w:rPr>
-          <w:rFonts w:ascii="Arial" w:eastAsia="Times New Roman" w:hAnsi="Arial"/>
-          <w:lang w:eastAsia="es-ES"/>
-        </w:rPr>
-        <w:t xml:space="preserve">. Aunque esta técnica constituye el estándar de oro en problemas de aprendizaje supervisado donde se asume que las observaciones son independientes e idénticamente distribuidas (i.i.d.), su aplicación en el dominio de la detección de fraude resulta metodológicamente inválida al violar la dependencia temporal intrínseca de las transacciones. El uso de una división aleatoria mezcla inevitablemente datos del futuro en el conjunto de entrenamiento, permitiendo al modelo "aprender" patrones de fraudes que aún no han ocurrido cronológicamente. Este fenómeno, conocido como </w:t>
       </w:r>
       <w:r>
         <w:rPr>
@@ -10524,6 +10759,29 @@
           <w:iCs/>
           <w:lang w:eastAsia="es-ES"/>
         </w:rPr>
+        <w:t>Random K-Fold Cross Validation</w:t>
+      </w:r>
+      <w:r>
+        <w:rPr>
+          <w:rFonts w:ascii="Arial" w:eastAsia="Times New Roman" w:hAnsi="Arial"/>
+          <w:lang w:eastAsia="es-ES"/>
+        </w:rPr>
+        <w:t xml:space="preserve">). </w:t>
+      </w:r>
+      <w:r>
+        <w:rPr>
+          <w:rFonts w:ascii="Arial" w:eastAsia="Times New Roman" w:hAnsi="Arial"/>
+          <w:lang w:eastAsia="es-ES"/>
+        </w:rPr>
+        <w:t xml:space="preserve">Aunque esta técnica constituye el estándar de oro en problemas de aprendizaje supervisado donde se asume que las observaciones son independientes e idénticamente distribuidas (i.i.d.), su aplicación en el dominio de la detección de fraude resulta metodológicamente inválida al violar la dependencia temporal intrínseca de las transacciones. El uso de una división aleatoria mezcla inevitablemente datos del futuro en el conjunto de entrenamiento, permitiendo al modelo "aprender" patrones de fraudes que aún no han ocurrido cronológicamente. Este fenómeno, conocido como </w:t>
+      </w:r>
+      <w:r>
+        <w:rPr>
+          <w:rFonts w:ascii="Arial" w:eastAsia="Times New Roman" w:hAnsi="Arial"/>
+          <w:i/>
+          <w:iCs/>
+          <w:lang w:eastAsia="es-ES"/>
+        </w:rPr>
         <w:t>Data Leakage</w:t>
       </w:r>
       <w:r>
@@ -10549,13 +10807,12 @@
           <w:rFonts w:ascii="Arial" w:eastAsia="Times New Roman" w:hAnsi="Arial"/>
           <w:lang w:eastAsia="es-ES"/>
         </w:rPr>
+        <w:lastRenderedPageBreak/>
         <w:t xml:space="preserve">Para corregir este sesgo estructural, el estudio adopta una estrategia de </w:t>
       </w:r>
       <w:r>
         <w:rPr>
           <w:rFonts w:ascii="Arial" w:eastAsia="Times New Roman" w:hAnsi="Arial"/>
-          <w:b/>
-          <w:bCs/>
           <w:lang w:eastAsia="es-ES"/>
         </w:rPr>
         <w:t xml:space="preserve">Validación </w:t>
@@ -10564,8 +10821,6 @@
       <w:r>
         <w:rPr>
           <w:rFonts w:ascii="Arial" w:eastAsia="Times New Roman" w:hAnsi="Arial"/>
-          <w:b/>
-          <w:bCs/>
           <w:lang w:eastAsia="es-ES"/>
         </w:rPr>
         <w:t>Pre</w:t>
@@ -10573,8 +10828,6 @@
       <w:r>
         <w:rPr>
           <w:rFonts w:ascii="Arial" w:eastAsia="Times New Roman" w:hAnsi="Arial"/>
-          <w:b/>
-          <w:bCs/>
           <w:lang w:eastAsia="es-ES"/>
         </w:rPr>
         <w:t>q</w:t>
@@ -10582,18 +10835,9 @@
       <w:r>
         <w:rPr>
           <w:rFonts w:ascii="Arial" w:eastAsia="Times New Roman" w:hAnsi="Arial"/>
-          <w:b/>
-          <w:bCs/>
-          <w:lang w:eastAsia="es-ES"/>
-        </w:rPr>
-        <w:t>uencial</w:t>
-      </w:r>
-      <w:r>
-        <w:rPr>
-          <w:rFonts w:ascii="Arial" w:eastAsia="Times New Roman" w:hAnsi="Arial"/>
-          <w:lang w:eastAsia="es-ES"/>
-        </w:rPr>
-        <w:t xml:space="preserve"> </w:t>
+          <w:lang w:eastAsia="es-ES"/>
+        </w:rPr>
+        <w:t xml:space="preserve">uencial </w:t>
       </w:r>
       <w:commentRangeEnd w:id="31"/>
       <w:r>
@@ -10627,23 +10871,7 @@
           <w:rFonts w:ascii="Arial" w:eastAsia="Times New Roman" w:hAnsi="Arial"/>
           <w:lang w:eastAsia="es-ES"/>
         </w:rPr>
-        <w:t xml:space="preserve">), la cual respeta estrictamente la flecha del tiempo. El protocolo implementado divide el conjunto de datos en bloques secuenciales, introduciendo un componente crítico: el </w:t>
-      </w:r>
-      <w:r>
-        <w:rPr>
-          <w:rFonts w:ascii="Arial" w:eastAsia="Times New Roman" w:hAnsi="Arial"/>
-          <w:b/>
-          <w:bCs/>
-          <w:lang w:eastAsia="es-ES"/>
-        </w:rPr>
-        <w:t>periodo de retraso</w:t>
-      </w:r>
-      <w:r>
-        <w:rPr>
-          <w:rFonts w:ascii="Arial" w:eastAsia="Times New Roman" w:hAnsi="Arial"/>
-          <w:lang w:eastAsia="es-ES"/>
-        </w:rPr>
-        <w:t xml:space="preserve"> (</w:t>
+        <w:t>), la cual respeta estrictamente la flecha del tiempo. El protocolo implementado divide el conjunto de datos en bloques secuenciales, introduciendo un componente crítico: el periodo de retraso (</w:t>
       </w:r>
       <w:r>
         <w:rPr>
@@ -10666,7 +10894,7 @@
       <w:pPr>
         <w:suppressAutoHyphens w:val="0"/>
         <w:spacing w:before="100" w:beforeAutospacing="1" w:after="100" w:afterAutospacing="1" w:line="240" w:lineRule="auto"/>
-        <w:jc w:val="left"/>
+        <w:jc w:val="center"/>
         <w:rPr>
           <w:rFonts w:ascii="Arial" w:eastAsia="Times New Roman" w:hAnsi="Arial"/>
           <w:lang w:eastAsia="es-ES"/>
@@ -10674,10 +10902,56 @@
       </w:pPr>
       <w:r>
         <w:rPr>
-          <w:rFonts w:ascii="Arial" w:eastAsia="Times New Roman" w:hAnsi="Arial"/>
-          <w:lang w:eastAsia="es-ES"/>
-        </w:rPr>
-        <w:t>Este margen temporal (establecido en 7 días para este estudio) simula la latencia operativa real que transcurre entre la ocurrencia de un fraude y su confirmación definitiva por parte de la entidad financiera o el cliente. La exclusión de los datos pertenecientes a este periodo "ciego" durante el entrenamiento impide que el modelo acceda a etiquetas que no estarían disponibles en el momento de la predicción.</w:t>
+          <w:noProof/>
+        </w:rPr>
+        <w:drawing>
+          <wp:inline distT="0" distB="0" distL="0" distR="0" wp14:anchorId="31E7B12A" wp14:editId="19B81FE8">
+            <wp:extent cx="4408714" cy="2069565"/>
+            <wp:effectExtent l="0" t="0" r="0" b="6985"/>
+            <wp:docPr id="402192847" name="Imagen 4"/>
+            <wp:cNvGraphicFramePr>
+              <a:graphicFrameLocks xmlns:a="http://schemas.openxmlformats.org/drawingml/2006/main" noChangeAspect="1"/>
+            </wp:cNvGraphicFramePr>
+            <a:graphic xmlns:a="http://schemas.openxmlformats.org/drawingml/2006/main">
+              <a:graphicData uri="http://schemas.openxmlformats.org/drawingml/2006/picture">
+                <pic:pic xmlns:pic="http://schemas.openxmlformats.org/drawingml/2006/picture">
+                  <pic:nvPicPr>
+                    <pic:cNvPr id="0" name="Picture 11"/>
+                    <pic:cNvPicPr>
+                      <a:picLocks noChangeAspect="1" noChangeArrowheads="1"/>
+                    </pic:cNvPicPr>
+                  </pic:nvPicPr>
+                  <pic:blipFill>
+                    <a:blip r:embed="rId21" cstate="print">
+                      <a:extLst>
+                        <a:ext uri="{28A0092B-C50C-407E-A947-70E740481C1C}">
+                          <a14:useLocalDpi xmlns:a14="http://schemas.microsoft.com/office/drawing/2010/main" val="0"/>
+                        </a:ext>
+                      </a:extLst>
+                    </a:blip>
+                    <a:srcRect/>
+                    <a:stretch>
+                      <a:fillRect/>
+                    </a:stretch>
+                  </pic:blipFill>
+                  <pic:spPr bwMode="auto">
+                    <a:xfrm>
+                      <a:off x="0" y="0"/>
+                      <a:ext cx="4421844" cy="2075728"/>
+                    </a:xfrm>
+                    <a:prstGeom prst="rect">
+                      <a:avLst/>
+                    </a:prstGeom>
+                    <a:noFill/>
+                    <a:ln>
+                      <a:noFill/>
+                    </a:ln>
+                  </pic:spPr>
+                </pic:pic>
+              </a:graphicData>
+            </a:graphic>
+          </wp:inline>
+        </w:drawing>
       </w:r>
     </w:p>
     <w:p>
@@ -10695,7 +10969,24 @@
           <w:rFonts w:ascii="Arial" w:eastAsia="Times New Roman" w:hAnsi="Arial"/>
           <w:lang w:eastAsia="es-ES"/>
         </w:rPr>
-        <w:lastRenderedPageBreak/>
+        <w:t>Este margen temporal (establecido en 7 días para este estudio) simula la latencia operativa real que transcurre entre la ocurrencia de un fraude y su confirmación definitiva por parte de la entidad financiera o el cliente. La exclusión de los datos pertenecientes a este periodo "ciego" durante el entrenamiento impide que el modelo acceda a etiquetas que no estarían disponibles en el momento de la predicción.</w:t>
+      </w:r>
+    </w:p>
+    <w:p>
+      <w:pPr>
+        <w:suppressAutoHyphens w:val="0"/>
+        <w:spacing w:before="100" w:beforeAutospacing="1" w:after="100" w:afterAutospacing="1" w:line="240" w:lineRule="auto"/>
+        <w:jc w:val="left"/>
+        <w:rPr>
+          <w:rFonts w:ascii="Arial" w:eastAsia="Times New Roman" w:hAnsi="Arial"/>
+          <w:lang w:eastAsia="es-ES"/>
+        </w:rPr>
+      </w:pPr>
+      <w:r>
+        <w:rPr>
+          <w:rFonts w:ascii="Arial" w:eastAsia="Times New Roman" w:hAnsi="Arial"/>
+          <w:lang w:eastAsia="es-ES"/>
+        </w:rPr>
         <w:t>La elección de un periodo de latencia (</w:t>
       </w:r>
       <w:r>
@@ -10862,6 +11153,7 @@
           <w:szCs w:val="22"/>
           <w:lang w:val="es-ES"/>
         </w:rPr>
+        <w:lastRenderedPageBreak/>
         <w:t>El valor diferencial de este estudio reside en que no asume la validez de los resultados por la mera ejecución de algoritmos estándar. Por el contrario, se ha diseñado una metodología extendida que cuestiona y valida la integridad del propio proceso de aprendizaje. Las contribuciones propias desarrolladas en este trabajo surgen como respuesta a dos carencias sistémicas identificadas en el estado del arte: la prevalencia de métricas de rendimiento ilusorias derivadas de diseños experimentales laxos y la inoperabilidad de modelos opacos ("cajas negras") en sectores sujetos a normativas estrictas.</w:t>
       </w:r>
     </w:p>
@@ -11074,15 +11366,7 @@
           <w:rFonts w:ascii="Arial" w:eastAsia="Times New Roman" w:hAnsi="Arial"/>
           <w:lang w:eastAsia="es-ES"/>
         </w:rPr>
-        <w:t xml:space="preserve">) o el Área Bajo la Curva ROC (AUC-ROC). Sin embargo, en un escenario de desbalance extremo donde el </w:t>
-      </w:r>
-      <w:r>
-        <w:rPr>
-          <w:rFonts w:ascii="Arial" w:eastAsia="Times New Roman" w:hAnsi="Arial"/>
-          <w:lang w:eastAsia="es-ES"/>
-        </w:rPr>
-        <w:lastRenderedPageBreak/>
-        <w:t>fraude representa apenas el 0,17% de las transacciones, estas métricas resultan matemáticamente ciegas al problema de negocio.</w:t>
+        <w:t>) o el Área Bajo la Curva ROC (AUC-ROC). Sin embargo, en un escenario de desbalance extremo donde el fraude representa apenas el 0,17% de las transacciones, estas métricas resultan matemáticamente ciegas al problema de negocio.</w:t>
       </w:r>
     </w:p>
     <w:p>
@@ -11182,8 +11466,6 @@
       <w:r>
         <w:rPr>
           <w:rFonts w:ascii="Arial" w:eastAsia="Times New Roman" w:hAnsi="Arial"/>
-          <w:b/>
-          <w:bCs/>
           <w:lang w:eastAsia="es-ES"/>
         </w:rPr>
         <w:t>Área Bajo la Curva de Precisión-Recall (AUPRC)</w:t>
@@ -11218,7 +11500,27 @@
           <w:sz w:val="24"/>
           <w:szCs w:val="24"/>
         </w:rPr>
-        <w:t>Incorporación de Métricas de Negocio (Card Precision@k):</w:t>
+        <w:t>Incorporación de Métricas de Negocio (</w:t>
+      </w:r>
+      <w:r>
+        <w:rPr>
+          <w:rFonts w:ascii="Arial" w:hAnsi="Arial" w:cs="Arial"/>
+          <w:color w:val="auto"/>
+          <w:sz w:val="24"/>
+          <w:szCs w:val="24"/>
+        </w:rPr>
+        <w:t>Card Precision@k</w:t>
+      </w:r>
+      <w:r>
+        <w:rPr>
+          <w:rFonts w:ascii="Arial" w:hAnsi="Arial" w:cs="Arial"/>
+          <w:i w:val="0"/>
+          <w:iCs w:val="0"/>
+          <w:color w:val="auto"/>
+          <w:sz w:val="24"/>
+          <w:szCs w:val="24"/>
+        </w:rPr>
+        <w:t>):</w:t>
       </w:r>
     </w:p>
     <w:p>
@@ -11241,18 +11543,18 @@
       <w:r>
         <w:rPr>
           <w:rFonts w:ascii="Arial" w:eastAsia="Times New Roman" w:hAnsi="Arial"/>
-          <w:b/>
-          <w:bCs/>
-          <w:lang w:eastAsia="es-ES"/>
-        </w:rPr>
-        <w:t>Card Precision@k (CP@k)</w:t>
+          <w:i/>
+          <w:iCs/>
+          <w:lang w:eastAsia="es-ES"/>
+        </w:rPr>
+        <w:t>Card Precision@k</w:t>
       </w:r>
       <w:r>
         <w:rPr>
           <w:rFonts w:ascii="Arial" w:eastAsia="Times New Roman" w:hAnsi="Arial"/>
           <w:lang w:eastAsia="es-ES"/>
         </w:rPr>
-        <w:t xml:space="preserve">, fijando </w:t>
+        <w:t xml:space="preserve"> (</w:t>
       </w:r>
       <w:r>
         <w:rPr>
@@ -11261,6 +11563,29 @@
           <w:iCs/>
           <w:lang w:eastAsia="es-ES"/>
         </w:rPr>
+        <w:t>CP@k</w:t>
+      </w:r>
+      <w:r>
+        <w:rPr>
+          <w:rFonts w:ascii="Arial" w:eastAsia="Times New Roman" w:hAnsi="Arial"/>
+          <w:lang w:eastAsia="es-ES"/>
+        </w:rPr>
+        <w:t>),</w:t>
+      </w:r>
+      <w:r>
+        <w:rPr>
+          <w:rFonts w:ascii="Arial" w:eastAsia="Times New Roman" w:hAnsi="Arial"/>
+          <w:lang w:eastAsia="es-ES"/>
+        </w:rPr>
+        <w:t xml:space="preserve"> fijando </w:t>
+      </w:r>
+      <w:r>
+        <w:rPr>
+          <w:rFonts w:ascii="Arial" w:eastAsia="Times New Roman" w:hAnsi="Arial"/>
+          <w:i/>
+          <w:iCs/>
+          <w:lang w:eastAsia="es-ES"/>
+        </w:rPr>
         <w:t>k=100</w:t>
       </w:r>
       <w:r>
@@ -11268,7 +11593,15 @@
           <w:rFonts w:ascii="Arial" w:eastAsia="Times New Roman" w:hAnsi="Arial"/>
           <w:lang w:eastAsia="es-ES"/>
         </w:rPr>
-        <w:t>. Esta decisión metodológica simula la capacidad finita de un equipo de analistas de fraude, que solo puede revisar humanamente un número limitado de alertas diarias (ej. 100).</w:t>
+        <w:t xml:space="preserve">. Esta decisión </w:t>
+      </w:r>
+      <w:r>
+        <w:rPr>
+          <w:rFonts w:ascii="Arial" w:eastAsia="Times New Roman" w:hAnsi="Arial"/>
+          <w:lang w:eastAsia="es-ES"/>
+        </w:rPr>
+        <w:lastRenderedPageBreak/>
+        <w:t>metodológica simula la capacidad finita de un equipo de analistas de fraude, que solo puede revisar humanamente un número limitado de alertas diarias (ej. 100).</w:t>
       </w:r>
     </w:p>
     <w:p>
@@ -11307,8 +11640,6 @@
       <w:r>
         <w:rPr>
           <w:rFonts w:ascii="Arial" w:eastAsia="Times New Roman" w:hAnsi="Arial"/>
-          <w:b/>
-          <w:bCs/>
           <w:lang w:eastAsia="es-ES"/>
         </w:rPr>
         <w:t>priorización efectiva</w:t>
@@ -11388,23 +11719,7 @@
           <w:rFonts w:ascii="Arial" w:eastAsia="Times New Roman" w:hAnsi="Arial"/>
           <w:lang w:eastAsia="es-ES"/>
         </w:rPr>
-        <w:t xml:space="preserve"> (fuga de datos), rara vez se cuantifica experimentalmente su impacto en la toma de decisiones de inversión tecnológica. Como contribución metodológica distintiva, este estudio no se limita a aplicar pasivamente las mejores prácticas, sino que ha diseñado y ejecutado una auditoría de control negativo (denominada </w:t>
-      </w:r>
-      <w:r>
-        <w:rPr>
-          <w:rFonts w:ascii="Arial" w:eastAsia="Times New Roman" w:hAnsi="Arial"/>
-          <w:b/>
-          <w:bCs/>
-          <w:lang w:eastAsia="es-ES"/>
-        </w:rPr>
-        <w:t>Experimento C</w:t>
-      </w:r>
-      <w:r>
-        <w:rPr>
-          <w:rFonts w:ascii="Arial" w:eastAsia="Times New Roman" w:hAnsi="Arial"/>
-          <w:lang w:eastAsia="es-ES"/>
-        </w:rPr>
-        <w:t>) para contrastar empíricamente la magnitud de este error silencioso.</w:t>
+        <w:t xml:space="preserve"> (fuga de datos), rara vez se cuantifica experimentalmente su impacto en la toma de decisiones de inversión tecnológica. Como contribución metodológica distintiva, este estudio no se limita a aplicar pasivamente las mejores prácticas, sino que ha diseñado y ejecutado una auditoría de control negativo para contrastar empíricamente la magnitud de este error silencioso.</w:t>
       </w:r>
     </w:p>
     <w:p>
@@ -11422,63 +11737,35 @@
           <w:rFonts w:ascii="Arial" w:eastAsia="Times New Roman" w:hAnsi="Arial"/>
           <w:lang w:eastAsia="es-ES"/>
         </w:rPr>
-        <w:t>El objetivo de esta intervención es demostrar que las métricas de rendimiento "perfectas" (AUC ≈ 1.0) reportadas frecuentemente en el estado del arte</w:t>
+        <w:t xml:space="preserve">El objetivo de esta intervención es demostrar que las métricas de rendimiento </w:t>
       </w:r>
       <w:r>
         <w:rPr>
           <w:rFonts w:ascii="Arial" w:eastAsia="Times New Roman" w:hAnsi="Arial"/>
           <w:lang w:eastAsia="es-ES"/>
         </w:rPr>
-        <w:t xml:space="preserve"> </w:t>
+        <w:t>"perfectas" (AUC ≈ 1.0) reportadas frecuentemente en el estado del arte</w:t>
       </w:r>
       <w:r>
         <w:rPr>
           <w:rFonts w:ascii="Arial" w:eastAsia="Times New Roman" w:hAnsi="Arial"/>
-          <w:b/>
-          <w:bCs/>
-          <w:lang w:eastAsia="es-ES"/>
-        </w:rPr>
-        <w:t>(Ileberi et al., 2021; Asha &amp; Kumar, 2021; Esghir et al., 2025)</w:t>
+          <w:lang w:eastAsia="es-ES"/>
+        </w:rPr>
+        <w:t xml:space="preserve"> (Ileberi et al., 2021; Asha &amp; Kumar, 2021; Esghir et al., 2025)</w:t>
       </w:r>
       <w:r>
         <w:rPr>
           <w:rFonts w:ascii="Arial" w:eastAsia="Times New Roman" w:hAnsi="Arial"/>
           <w:lang w:eastAsia="es-ES"/>
         </w:rPr>
-        <w:t xml:space="preserve"> no son fruto de la superioridad algorítmica, sino </w:t>
+        <w:t xml:space="preserve"> no son fruto de la superioridad algorítmica, sino artefactos metodológicos derivados de un diseño experimental defectuoso</w:t>
       </w:r>
       <w:r>
         <w:rPr>
           <w:rFonts w:ascii="Arial" w:eastAsia="Times New Roman" w:hAnsi="Arial"/>
-          <w:b/>
-          <w:bCs/>
-          <w:lang w:eastAsia="es-ES"/>
-        </w:rPr>
-        <w:t>artefactos metodológicos</w:t>
-      </w:r>
-      <w:r>
-        <w:rPr>
-          <w:rFonts w:ascii="Arial" w:eastAsia="Times New Roman" w:hAnsi="Arial"/>
-          <w:lang w:eastAsia="es-ES"/>
-        </w:rPr>
-        <w:t xml:space="preserve"> derivados de un diseño experimental defectuoso</w:t>
-      </w:r>
-      <w:r>
-        <w:rPr>
-          <w:rFonts w:ascii="Arial" w:eastAsia="Times New Roman" w:hAnsi="Arial"/>
-          <w:lang w:eastAsia="es-ES"/>
-        </w:rPr>
-        <w:t xml:space="preserve"> y no reproducibles en entornos productivos. Investigaciones como la de </w:t>
-      </w:r>
-      <w:r>
-        <w:rPr>
-          <w:rFonts w:ascii="Arial" w:eastAsia="Times New Roman" w:hAnsi="Arial"/>
-          <w:b/>
-          <w:bCs/>
-          <w:lang w:eastAsia="es-ES"/>
-        </w:rPr>
-        <w:lastRenderedPageBreak/>
-        <w:t>Hayat &amp; Magnier (2025)</w:t>
+          <w:lang w:eastAsia="es-ES"/>
+        </w:rPr>
+        <w:t xml:space="preserve"> y no reproducibles en entornos productivos. Investigaciones como la de Hayat &amp; Magnier (2025)</w:t>
       </w:r>
       <w:r>
         <w:rPr>
@@ -11735,6 +12022,7 @@
           <w:bCs/>
           <w:lang w:eastAsia="es-ES"/>
         </w:rPr>
+        <w:lastRenderedPageBreak/>
         <w:t>Preprocesamiento Global:</w:t>
       </w:r>
       <w:r>
@@ -11796,8 +12084,6 @@
       <w:r>
         <w:rPr>
           <w:rFonts w:ascii="Arial" w:eastAsia="Times New Roman" w:hAnsi="Arial"/>
-          <w:b/>
-          <w:bCs/>
           <w:lang w:eastAsia="es-ES"/>
         </w:rPr>
         <w:t>cuantificación de la inflación artificial</w:t>
@@ -11895,24 +12181,14 @@
           <w:rFonts w:ascii="Arial" w:eastAsia="Times New Roman" w:hAnsi="Arial"/>
           <w:lang w:eastAsia="es-ES"/>
         </w:rPr>
-        <w:lastRenderedPageBreak/>
         <w:t xml:space="preserve">En un entorno bancario sujeto a regulaciones estrictas (como el RGPD en Europa o las normativas de riesgo crediticio de Basilea), la opacidad algorítmica es inaceptable. Un sistema de detección de fraude no solo debe ser preciso, sino auditable: la entidad financiera debe ser capaz de justificar ante el cliente o el regulador </w:t>
       </w:r>
       <w:r>
         <w:rPr>
           <w:rFonts w:ascii="Arial" w:eastAsia="Times New Roman" w:hAnsi="Arial"/>
-          <w:b/>
-          <w:bCs/>
-          <w:lang w:eastAsia="es-ES"/>
-        </w:rPr>
-        <w:t>por qué</w:t>
-      </w:r>
-      <w:r>
-        <w:rPr>
-          <w:rFonts w:ascii="Arial" w:eastAsia="Times New Roman" w:hAnsi="Arial"/>
-          <w:lang w:eastAsia="es-ES"/>
-        </w:rPr>
-        <w:t xml:space="preserve"> se bloqueó una transacción específica.</w:t>
+          <w:lang w:eastAsia="es-ES"/>
+        </w:rPr>
+        <w:t>por qué se bloqueó una transacción específica.</w:t>
       </w:r>
     </w:p>
     <w:p>
@@ -11930,39 +12206,7 @@
           <w:rFonts w:ascii="Arial" w:eastAsia="Times New Roman" w:hAnsi="Arial"/>
           <w:lang w:eastAsia="es-ES"/>
         </w:rPr>
-        <w:t xml:space="preserve">Para resolver este desafío, este TFM extiende el flujo de trabajo original integrando una capa de </w:t>
-      </w:r>
-      <w:r>
-        <w:rPr>
-          <w:rFonts w:ascii="Arial" w:eastAsia="Times New Roman" w:hAnsi="Arial"/>
-          <w:b/>
-          <w:bCs/>
-          <w:lang w:eastAsia="es-ES"/>
-        </w:rPr>
-        <w:t>Interpretabilidad Post-Hoc</w:t>
-      </w:r>
-      <w:r>
-        <w:rPr>
-          <w:rFonts w:ascii="Arial" w:eastAsia="Times New Roman" w:hAnsi="Arial"/>
-          <w:lang w:eastAsia="es-ES"/>
-        </w:rPr>
-        <w:t xml:space="preserve"> basada en la Teoría de Juegos, específicamente mediante el uso de valores </w:t>
-      </w:r>
-      <w:r>
-        <w:rPr>
-          <w:rFonts w:ascii="Arial" w:eastAsia="Times New Roman" w:hAnsi="Arial"/>
-          <w:b/>
-          <w:bCs/>
-          <w:lang w:eastAsia="es-ES"/>
-        </w:rPr>
-        <w:t>SHAP</w:t>
-      </w:r>
-      <w:r>
-        <w:rPr>
-          <w:rFonts w:ascii="Arial" w:eastAsia="Times New Roman" w:hAnsi="Arial"/>
-          <w:lang w:eastAsia="es-ES"/>
-        </w:rPr>
-        <w:t xml:space="preserve"> (</w:t>
+        <w:t>Para resolver este desafío, este TFM extiende el flujo de trabajo original integrando una capa de Interpretabilidad Post-Hoc basada en la Teoría de Juegos, específicamente mediante el uso de valores SHAP (</w:t>
       </w:r>
       <w:r>
         <w:rPr>
@@ -11971,7 +12215,16 @@
           <w:iCs/>
           <w:lang w:eastAsia="es-ES"/>
         </w:rPr>
-        <w:t>SHapley Additive exPlanations</w:t>
+        <w:t>SHapley</w:t>
+      </w:r>
+      <w:r>
+        <w:rPr>
+          <w:rFonts w:ascii="Arial" w:eastAsia="Times New Roman" w:hAnsi="Arial"/>
+          <w:i/>
+          <w:iCs/>
+          <w:lang w:eastAsia="es-ES"/>
+        </w:rPr>
+        <w:t xml:space="preserve"> Additive exPlanations</w:t>
       </w:r>
       <w:r>
         <w:rPr>
@@ -12104,7 +12357,15 @@
           <w:rFonts w:ascii="Arial" w:eastAsia="Times New Roman" w:hAnsi="Arial"/>
           <w:lang w:eastAsia="es-ES"/>
         </w:rPr>
-        <w:t xml:space="preserve"> Se habilita la capacidad de generar una "autopsia" instantánea para cada predicción individual. El sistema descompone la puntuación de riesgo de una transacción específica en la suma de las contribuciones de cada característica. Esta funcionalidad dota a los analistas de fraude de una herramienta de soporte a la decisión, permitiéndoles distinguir rápidamente entre un falso positivo (ej. un comportamiento inusual pero explicable) y un fraude real (ej. coincidencia de terminal comprometido y monto anómalo), optimizando así los tiempos de investigación manual.</w:t>
+        <w:t xml:space="preserve"> Se habilita la capacidad de generar una "autopsia" instantánea para cada predicción individual. El sistema </w:t>
+      </w:r>
+      <w:r>
+        <w:rPr>
+          <w:rFonts w:ascii="Arial" w:eastAsia="Times New Roman" w:hAnsi="Arial"/>
+          <w:lang w:eastAsia="es-ES"/>
+        </w:rPr>
+        <w:lastRenderedPageBreak/>
+        <w:t>descompone la puntuación de riesgo de una transacción específica en la suma de las contribuciones de cada característica. Esta funcionalidad dota a los analistas de fraude de una herramienta de soporte a la decisión, permitiéndoles distinguir rápidamente entre un falso positivo (ej. un comportamiento inusual pero explicable) y un fraude real (ej. coincidencia de terminal comprometido y monto anómalo), optimizando así los tiempos de investigación manual.</w:t>
       </w:r>
     </w:p>
     <w:p>
@@ -12127,8 +12388,6 @@
       <w:r>
         <w:rPr>
           <w:rFonts w:ascii="Arial" w:eastAsia="Times New Roman" w:hAnsi="Arial"/>
-          <w:b/>
-          <w:bCs/>
           <w:lang w:eastAsia="es-ES"/>
         </w:rPr>
         <w:t>Transparencia Algorítmica</w:t>
@@ -12219,15 +12478,7 @@
           <w:rFonts w:ascii="Arial" w:hAnsi="Arial"/>
           <w:lang w:eastAsia="es-ES"/>
         </w:rPr>
-        <w:t xml:space="preserve"> públicos anonimizados (donde se pierde el significado </w:t>
-      </w:r>
-      <w:r>
-        <w:rPr>
-          <w:rFonts w:ascii="Arial" w:hAnsi="Arial"/>
-          <w:lang w:eastAsia="es-ES"/>
-        </w:rPr>
-        <w:lastRenderedPageBreak/>
-        <w:t>de las variables originales), esta investigación fundamenta su base empírica en la generación controlada de un conjunto de datos sintético.</w:t>
+        <w:t xml:space="preserve"> públicos anonimizados (donde se pierde el significado de las variables originales), esta investigación fundamenta su base empírica en la generación controlada de un conjunto de datos sintético.</w:t>
       </w:r>
     </w:p>
     <w:p>
@@ -12346,7 +12597,15 @@
           <w:rFonts w:ascii="Arial" w:hAnsi="Arial"/>
           <w:lang w:eastAsia="es-ES"/>
         </w:rPr>
-        <w:t xml:space="preserve"> Finalmente, se superponen patrones de fraude conocidos sobre el flujo legítimo. El simulador compromete un porcentaje de los terminales durante ventanas temporales específicas de hasta 28 días. Si un cliente legítimo realiza una operación en un terminal comprometido, su tarjeta se "infecta" y comienza a emitir transacciones fraudulentas en los días posteriores, mimetizando las dinámicas reales de </w:t>
+        <w:t xml:space="preserve"> Finalmente, se superponen patrones de fraude conocidos sobre el flujo legítimo. El simulador compromete un porcentaje de los terminales durante ventanas temporales específicas de hasta 28 días. Si un cliente legítimo realiza una operación en un terminal comprometido, su tarjeta se "infecta" y comienza a emitir transacciones fraudulentas en los días </w:t>
+      </w:r>
+      <w:r>
+        <w:rPr>
+          <w:rFonts w:ascii="Arial" w:hAnsi="Arial"/>
+          <w:lang w:eastAsia="es-ES"/>
+        </w:rPr>
+        <w:lastRenderedPageBreak/>
+        <w:t xml:space="preserve">posteriores, mimetizando las dinámicas reales de </w:t>
       </w:r>
       <w:r>
         <w:rPr>
@@ -12482,8 +12741,6 @@
       <w:r>
         <w:rPr>
           <w:rFonts w:ascii="Arial" w:hAnsi="Arial"/>
-          <w:b/>
-          <w:bCs/>
         </w:rPr>
         <w:t>Docker</w:t>
       </w:r>
@@ -12545,8 +12802,6 @@
       <w:r>
         <w:rPr>
           <w:rFonts w:ascii="Arial" w:hAnsi="Arial"/>
-          <w:b/>
-          <w:bCs/>
         </w:rPr>
         <w:t>Python 3.9</w:t>
       </w:r>
@@ -12600,7 +12855,6 @@
           <w:b/>
           <w:bCs/>
         </w:rPr>
-        <w:lastRenderedPageBreak/>
         <w:t>Scikit-Learn:</w:t>
       </w:r>
       <w:r>
@@ -12701,16 +12955,14 @@
       <w:r>
         <w:rPr>
           <w:rFonts w:ascii="Arial" w:hAnsi="Arial"/>
-          <w:b/>
-          <w:bCs/>
-        </w:rPr>
-        <w:t>semilla global</w:t>
-      </w:r>
-      <w:r>
-        <w:rPr>
-          <w:rFonts w:ascii="Arial" w:hAnsi="Arial"/>
-        </w:rPr>
-        <w:t xml:space="preserve"> (random_state=42) en todos los procesos estocásticos. Este control estricto asegura que cualquier diferencia observada en el rendimiento de los modelos sea atribuible exclusivamente a las decisiones metodológicas (ej. uso de </w:t>
+        </w:rPr>
+        <w:t xml:space="preserve">semilla global </w:t>
+      </w:r>
+      <w:r>
+        <w:rPr>
+          <w:rFonts w:ascii="Arial" w:hAnsi="Arial"/>
+        </w:rPr>
+        <w:t xml:space="preserve">(random_state=42) en todos los procesos estocásticos. Este control estricto asegura que cualquier diferencia observada en el rendimiento de los modelos sea atribuible exclusivamente a las decisiones metodológicas (ej. uso de </w:t>
       </w:r>
       <w:r>
         <w:rPr>
@@ -12833,6 +13085,7 @@
           <w:iCs w:val="0"/>
           <w:color w:val="auto"/>
         </w:rPr>
+        <w:lastRenderedPageBreak/>
         <w:t>Área Bajo la Curva de Precisión-Recall (AUPRC)</w:t>
       </w:r>
     </w:p>
@@ -13298,14 +13551,7 @@
         <w:rPr>
           <w:rFonts w:ascii="Arial" w:hAnsi="Arial"/>
         </w:rPr>
-        <w:t xml:space="preserve"> es realmente un fraude. El valor final reportado es el promedio de esta precisión </w:t>
-      </w:r>
-      <w:r>
-        <w:rPr>
-          <w:rFonts w:ascii="Arial" w:hAnsi="Arial"/>
-        </w:rPr>
-        <w:lastRenderedPageBreak/>
-        <w:t>diaria a lo largo de todo el conjunto de prueba, ofreciendo una visión directa del retorno de inversión (ROI) del modelo.</w:t>
+        <w:t xml:space="preserve"> es realmente un fraude. El valor final reportado es el promedio de esta precisión diaria a lo largo de todo el conjunto de prueba, ofreciendo una visión directa del retorno de inversión (ROI) del modelo.</w:t>
       </w:r>
     </w:p>
     <w:p>
@@ -13540,6 +13786,7 @@
           <w:rFonts w:ascii="Arial" w:eastAsia="Times New Roman" w:hAnsi="Arial"/>
           <w:lang w:eastAsia="es-ES"/>
         </w:rPr>
+        <w:lastRenderedPageBreak/>
         <w:t xml:space="preserve">La </w:t>
       </w:r>
       <w:r>
@@ -13755,15 +14002,7 @@
           <w:rFonts w:ascii="Arial" w:eastAsia="Times New Roman" w:hAnsi="Arial"/>
           <w:lang w:eastAsia="es-ES"/>
         </w:rPr>
-        <w:t xml:space="preserve"> </w:t>
-      </w:r>
-      <w:r>
-        <w:rPr>
-          <w:rFonts w:ascii="Arial" w:eastAsia="Times New Roman" w:hAnsi="Arial"/>
-          <w:lang w:eastAsia="es-ES"/>
-        </w:rPr>
-        <w:lastRenderedPageBreak/>
-        <w:t xml:space="preserve">y </w:t>
+        <w:t xml:space="preserve"> y </w:t>
       </w:r>
       <w:r>
         <w:rPr>
@@ -14029,6 +14268,7 @@
           <w:iCs/>
           <w:lang w:eastAsia="es-ES"/>
         </w:rPr>
+        <w:lastRenderedPageBreak/>
         <w:t>Regresión Logística:</w:t>
       </w:r>
       <w:r>
@@ -14299,7 +14539,6 @@
           <w:sz w:val="28"/>
           <w:szCs w:val="28"/>
         </w:rPr>
-        <w:lastRenderedPageBreak/>
         <w:t>Hipótesis de Trabajo</w:t>
       </w:r>
     </w:p>
@@ -14369,8 +14608,6 @@
       <w:r>
         <w:rPr>
           <w:rFonts w:ascii="Arial" w:hAnsi="Arial"/>
-          <w:b/>
-          <w:bCs/>
           <w:lang w:eastAsia="es-ES"/>
         </w:rPr>
         <w:t>AUPRC</w:t>
@@ -14504,6 +14741,7 @@
           <w:sz w:val="28"/>
           <w:szCs w:val="28"/>
         </w:rPr>
+        <w:lastRenderedPageBreak/>
         <w:t>Configuración Experimental</w:t>
       </w:r>
     </w:p>
@@ -14765,7 +15003,6 @@
           <w:iCs/>
           <w:lang w:eastAsia="es-ES"/>
         </w:rPr>
-        <w:lastRenderedPageBreak/>
         <w:t>Preprocesamiento:</w:t>
       </w:r>
       <w:r>
@@ -14999,7 +15236,15 @@
           <w:rFonts w:ascii="Arial" w:hAnsi="Arial"/>
           <w:lang w:eastAsia="es-ES"/>
         </w:rPr>
-        <w:t>El último hito del diseño experimental tiene como propósito auditar la lógica interna del modelo de detección. En entornos financieros sujetos a estricto escrutinio regulatorio, la alta precisión de un modelo de "caja negra" carece de valor operativo si sus decisiones no pueden ser justificadas. Por tanto, el objetivo de esta fase es transicionar hacia un paradigma de "caja blanca", validando que el algoritmo toma decisiones basadas en patrones financieros lógicos y no mediante la explotación de asociaciones engañosas o sesgos inherentes a la generación sintética de datos. Adicionalmente, se busca dotar a los analistas de fraude de una herramienta que traduzca la probabilidad matemática en motivos de alerta procesables.</w:t>
+        <w:t xml:space="preserve">El último hito del diseño experimental tiene como propósito auditar la lógica interna del modelo de detección. En entornos financieros sujetos a estricto escrutinio regulatorio, la alta precisión de un modelo de "caja negra" carece de valor operativo si sus decisiones no pueden ser justificadas. Por tanto, el objetivo de esta fase es transicionar hacia un </w:t>
+      </w:r>
+      <w:r>
+        <w:rPr>
+          <w:rFonts w:ascii="Arial" w:hAnsi="Arial"/>
+          <w:lang w:eastAsia="es-ES"/>
+        </w:rPr>
+        <w:lastRenderedPageBreak/>
+        <w:t>paradigma de "caja blanca", validando que el algoritmo toma decisiones basadas en patrones financieros lógicos y no mediante la explotación de asociaciones engañosas o sesgos inherentes a la generación sintética de datos. Adicionalmente, se busca dotar a los analistas de fraude de una herramienta que traduzca la probabilidad matemática en motivos de alerta procesables.</w:t>
       </w:r>
     </w:p>
     <w:p>
@@ -15195,33 +15440,13 @@
       <w:r>
         <w:rPr>
           <w:rFonts w:ascii="Arial" w:hAnsi="Arial"/>
-          <w:b/>
-          <w:bCs/>
-          <w:lang w:eastAsia="es-ES"/>
-        </w:rPr>
-        <w:t>(Lundberg &amp; Lee, 2017)</w:t>
-      </w:r>
-      <w:r>
-        <w:rPr>
-          <w:rFonts w:ascii="Arial" w:hAnsi="Arial"/>
-          <w:lang w:eastAsia="es-ES"/>
-        </w:rPr>
-        <w:t xml:space="preserve">. Esta técnica calcula la contribución marginal exacta que cada variable aporta a la predicción final, garantizando consistencia matemática. Tal y como se definió en la arquitectura del ensayo, esta capa analítica se aplica </w:t>
-      </w:r>
-      <w:r>
-        <w:rPr>
-          <w:rFonts w:ascii="Arial" w:hAnsi="Arial"/>
-          <w:b/>
-          <w:bCs/>
-          <w:lang w:eastAsia="es-ES"/>
-        </w:rPr>
-        <w:t>estrictamente sobre el modelo ganador definitivo (</w:t>
-      </w:r>
-      <w:r>
-        <w:rPr>
-          <w:rFonts w:ascii="Arial" w:hAnsi="Arial"/>
-          <w:b/>
-          <w:bCs/>
+          <w:lang w:eastAsia="es-ES"/>
+        </w:rPr>
+        <w:t>(Lundberg &amp; Lee, 2017). Esta técnica calcula la contribución marginal exacta que cada variable aporta a la predicción final, garantizando consistencia matemática. Tal y como se definió en la arquitectura del ensayo, esta capa analítica se aplica estrictamente sobre el modelo ganador definitivo (</w:t>
+      </w:r>
+      <w:r>
+        <w:rPr>
+          <w:rFonts w:ascii="Arial" w:hAnsi="Arial"/>
           <w:i/>
           <w:iCs/>
           <w:lang w:eastAsia="es-ES"/>
@@ -15231,18 +15456,9 @@
       <w:r>
         <w:rPr>
           <w:rFonts w:ascii="Arial" w:hAnsi="Arial"/>
-          <w:b/>
-          <w:bCs/>
-          <w:lang w:eastAsia="es-ES"/>
-        </w:rPr>
-        <w:t>)</w:t>
-      </w:r>
-      <w:r>
-        <w:rPr>
-          <w:rFonts w:ascii="Arial" w:hAnsi="Arial"/>
-          <w:lang w:eastAsia="es-ES"/>
-        </w:rPr>
-        <w:t>. Para su evaluación, se instrumentan dos niveles de inspección visual:</w:t>
+          <w:lang w:eastAsia="es-ES"/>
+        </w:rPr>
+        <w:t>). Para su evaluación, se instrumentan dos niveles de inspección visual:</w:t>
       </w:r>
     </w:p>
     <w:p>
@@ -15266,7 +15482,6 @@
           <w:iCs/>
           <w:lang w:eastAsia="es-ES"/>
         </w:rPr>
-        <w:lastRenderedPageBreak/>
         <w:t>Análisis de Explicabilidad Global (Gráficos de Resumen / Beeswarm Plots):</w:t>
       </w:r>
       <w:r>
@@ -15386,7 +15601,15 @@
           <w:rFonts w:ascii="Arial" w:hAnsi="Arial"/>
           <w:lang w:eastAsia="es-ES"/>
         </w:rPr>
-        <w:t>A nivel de direccionalidad, la hipótesis anticipa que el análisis SHAP confirmará la coherencia del modelo con la intuición experta del negocio bancario. Específicamente, se espera observar relaciones monótonas justificables, donde parámetros como un alto índice de fraude reciente en un cajero (TERMINAL_ID_RISK) actúen como vectores de fuerza positivos (empujando la probabilidad hacia la clasificación de fraude), mientras que un comportamiento de gasto habitual actúe como ancla de legitimidad.</w:t>
+        <w:t xml:space="preserve">A nivel de direccionalidad, la hipótesis anticipa que el análisis SHAP confirmará la coherencia del modelo con la intuición experta del negocio bancario. Específicamente, </w:t>
+      </w:r>
+      <w:r>
+        <w:rPr>
+          <w:rFonts w:ascii="Arial" w:hAnsi="Arial"/>
+          <w:lang w:eastAsia="es-ES"/>
+        </w:rPr>
+        <w:lastRenderedPageBreak/>
+        <w:t>se espera observar relaciones monótonas justificables, donde parámetros como un alto índice de fraude reciente en un cajero (TERMINAL_ID_RISK) actúen como vectores de fuerza positivos (empujando la probabilidad hacia la clasificación de fraude), mientras que un comportamiento de gasto habitual actúe como ancla de legitimidad.</w:t>
       </w:r>
     </w:p>
     <w:p>
@@ -15641,7 +15864,7 @@
                     <pic:cNvPicPr/>
                   </pic:nvPicPr>
                   <pic:blipFill>
-                    <a:blip r:embed="rId16"/>
+                    <a:blip r:embed="rId22"/>
                     <a:stretch>
                       <a:fillRect/>
                     </a:stretch>
@@ -15701,6 +15924,61 @@
           <w:rFonts w:ascii="Arial" w:hAnsi="Arial"/>
         </w:rPr>
         <w:t>justifica formalmente la exclusión de la exactitud y de la curva ROC como criterios de decisión, alineándose con la literatura especializada que demuestra matemáticamente que la métrica AUPRC es la única herramienta robusta ante distribuciones de desbalance extremo (Saito &amp; Rehmsmeier, 2015; He &amp; Garcia, 2009; Fernández et al., 2018).</w:t>
+      </w:r>
+    </w:p>
+    <w:p>
+      <w:pPr>
+        <w:spacing w:line="240" w:lineRule="auto"/>
+        <w:jc w:val="center"/>
+        <w:rPr>
+          <w:rFonts w:ascii="Arial" w:hAnsi="Arial"/>
+        </w:rPr>
+      </w:pPr>
+      <w:r>
+        <w:rPr>
+          <w:noProof/>
+        </w:rPr>
+        <w:drawing>
+          <wp:inline distT="0" distB="0" distL="0" distR="0" wp14:anchorId="1C3E0083" wp14:editId="4D5FA563">
+            <wp:extent cx="4762500" cy="2106835"/>
+            <wp:effectExtent l="0" t="0" r="0" b="8255"/>
+            <wp:docPr id="342628801" name="Gráfico 1"/>
+            <wp:cNvGraphicFramePr>
+              <a:graphicFrameLocks xmlns:a="http://schemas.openxmlformats.org/drawingml/2006/main" noChangeAspect="1"/>
+            </wp:cNvGraphicFramePr>
+            <a:graphic xmlns:a="http://schemas.openxmlformats.org/drawingml/2006/main">
+              <a:graphicData uri="http://schemas.openxmlformats.org/drawingml/2006/picture">
+                <pic:pic xmlns:pic="http://schemas.openxmlformats.org/drawingml/2006/picture">
+                  <pic:nvPicPr>
+                    <pic:cNvPr id="342628801" name=""/>
+                    <pic:cNvPicPr/>
+                  </pic:nvPicPr>
+                  <pic:blipFill>
+                    <a:blip r:embed="rId23">
+                      <a:extLst>
+                        <a:ext uri="{96DAC541-7B7A-43D3-8B79-37D633B846F1}">
+                          <asvg:svgBlip xmlns:asvg="http://schemas.microsoft.com/office/drawing/2016/SVG/main" r:embed="rId24"/>
+                        </a:ext>
+                      </a:extLst>
+                    </a:blip>
+                    <a:stretch>
+                      <a:fillRect/>
+                    </a:stretch>
+                  </pic:blipFill>
+                  <pic:spPr>
+                    <a:xfrm>
+                      <a:off x="0" y="0"/>
+                      <a:ext cx="4784774" cy="2116689"/>
+                    </a:xfrm>
+                    <a:prstGeom prst="rect">
+                      <a:avLst/>
+                    </a:prstGeom>
+                  </pic:spPr>
+                </pic:pic>
+              </a:graphicData>
+            </a:graphic>
+          </wp:inline>
+        </w:drawing>
       </w:r>
     </w:p>
     <w:p>
@@ -16582,7 +16860,15 @@
           <w:rFonts w:ascii="Arial" w:eastAsia="Times New Roman" w:hAnsi="Arial"/>
           <w:lang w:eastAsia="es-ES"/>
         </w:rPr>
-        <w:t>). Resulta especialmente reveladora la configuración de sus hiperparámetros óptimos: el algoritmo favoreció árboles muy poco profundos (max_depth=3) iterados sobre 100 estimadores. Esta configuración genera un modelo intencionadamente conservador que penaliza el sobreajuste (</w:t>
+        <w:t xml:space="preserve">). Resulta especialmente reveladora la configuración de sus hiperparámetros óptimos: el algoritmo favoreció árboles muy poco profundos (max_depth=3) iterados sobre 100 estimadores. Esta </w:t>
+      </w:r>
+      <w:r>
+        <w:rPr>
+          <w:rFonts w:ascii="Arial" w:eastAsia="Times New Roman" w:hAnsi="Arial"/>
+          <w:lang w:eastAsia="es-ES"/>
+        </w:rPr>
+        <w:lastRenderedPageBreak/>
+        <w:t>configuración genera un modelo intencionadamente conservador que penaliza el sobreajuste (</w:t>
       </w:r>
       <w:r>
         <w:rPr>
@@ -16670,7 +16956,6 @@
           <w:noProof/>
           <w:lang w:eastAsia="es-ES"/>
         </w:rPr>
-        <w:lastRenderedPageBreak/>
         <w:drawing>
           <wp:inline distT="0" distB="0" distL="0" distR="0" wp14:anchorId="0341E886" wp14:editId="37C33E68">
             <wp:extent cx="5400040" cy="1687830"/>
@@ -16687,7 +16972,7 @@
                     <pic:cNvPicPr/>
                   </pic:nvPicPr>
                   <pic:blipFill>
-                    <a:blip r:embed="rId17"/>
+                    <a:blip r:embed="rId25"/>
                     <a:stretch>
                       <a:fillRect/>
                     </a:stretch>
@@ -16928,6 +17213,7 @@
         <w:rPr>
           <w:rFonts w:ascii="Arial" w:hAnsi="Arial"/>
         </w:rPr>
+        <w:lastRenderedPageBreak/>
         <w:t>Refinamiento del Modelo Base: Estrategia de Submuestreo (Undersampling)</w:t>
       </w:r>
       <w:bookmarkEnd w:id="52"/>
@@ -17016,7 +17302,6 @@
                 <w:color w:val="1F1F1F"/>
                 <w:bdr w:val="none" w:sz="0" w:space="0" w:color="auto" w:frame="1"/>
               </w:rPr>
-              <w:lastRenderedPageBreak/>
               <w:t>Escenario de Submuestreo</w:t>
             </w:r>
           </w:p>
@@ -17616,7 +17901,15 @@
           <w:rFonts w:ascii="Arial" w:eastAsia="Times New Roman" w:hAnsi="Arial"/>
           <w:lang w:eastAsia="es-ES"/>
         </w:rPr>
-        <w:t>Aunque el marco teórico inicial contemplaba el aprendizaje sensible al costo mediante la ponderación algorítmica (scale_pos_weight en XGBoost), la fase empírica demostró que su aplicación sobre la distribución natural (~118:1) mantenía un coste computacional prohibitivo en la fase de optimización. El submuestreo manual y controlado (ratio 5:1) resultó operativamente superior: simplificó drásticamente el espacio de características, filtró el ruido inherente a la clase mayoritaria y aceleró los tiempos de entrenamiento, logrando maximizar la métrica de negocio (CP@100) sin la sobrecarga de procesar la totalidad de las transacciones legítimas.</w:t>
+        <w:t xml:space="preserve">Aunque el marco teórico inicial contemplaba el aprendizaje sensible al costo mediante la ponderación algorítmica (scale_pos_weight en XGBoost), la fase empírica demostró </w:t>
+      </w:r>
+      <w:r>
+        <w:rPr>
+          <w:rFonts w:ascii="Arial" w:eastAsia="Times New Roman" w:hAnsi="Arial"/>
+          <w:lang w:eastAsia="es-ES"/>
+        </w:rPr>
+        <w:lastRenderedPageBreak/>
+        <w:t>que su aplicación sobre la distribución natural (~118:1) mantenía un coste computacional prohibitivo en la fase de optimización. El submuestreo manual y controlado (ratio 5:1) resultó operativamente superior: simplificó drásticamente el espacio de características, filtró el ruido inherente a la clase mayoritaria y aceleró los tiempos de entrenamiento, logrando maximizar la métrica de negocio (CP@100) sin la sobrecarga de procesar la totalidad de las transacciones legítimas.</w:t>
       </w:r>
     </w:p>
     <w:p>
@@ -17723,7 +18016,6 @@
           <w:rFonts w:ascii="Arial" w:hAnsi="Arial"/>
           <w:lang w:eastAsia="es-ES"/>
         </w:rPr>
-        <w:lastRenderedPageBreak/>
         <w:t>Para garantizar la consistencia del patrón, la auditoría se replicó sobre los tres modelos base (Regresión Logística, Random Forest y XGBoost).</w:t>
       </w:r>
     </w:p>
@@ -17795,211 +18087,22 @@
     <w:p>
       <w:pPr>
         <w:spacing w:line="240" w:lineRule="auto"/>
-        <w:rPr>
-          <w:rFonts w:ascii="Arial" w:hAnsi="Arial"/>
-          <w:lang w:eastAsia="es-ES"/>
-        </w:rPr>
-      </w:pPr>
-      <w:r>
-        <w:rPr>
-          <w:rFonts w:ascii="Arial" w:hAnsi="Arial"/>
-          <w:lang w:eastAsia="es-ES"/>
-        </w:rPr>
-        <w:t>Bajo estas condiciones de contaminación extrema, los algoritmos reportaron métricas ilusoriamente perfectas. La Regresión Logística alcanzó un AUPRC de 0.9287, mientras que los modelos de conjunto lograron memorizar el patrón por completo: Random Forest registró un AUPRC de 0.9999 y XGBoost un 0.9995. Adicionalmente, los valores de AUC ROC rozaron el 1.0 en los modelos de árboles.</w:t>
-      </w:r>
-    </w:p>
-    <w:p>
-      <w:pPr>
-        <w:spacing w:line="240" w:lineRule="auto"/>
-        <w:rPr>
-          <w:rFonts w:ascii="Arial" w:hAnsi="Arial"/>
-          <w:lang w:eastAsia="es-ES"/>
-        </w:rPr>
-      </w:pPr>
-      <w:r>
-        <w:rPr>
-          <w:rFonts w:ascii="Arial" w:hAnsi="Arial"/>
-          <w:lang w:eastAsia="es-ES"/>
-        </w:rPr>
-        <w:t>Estos resultados, frecuentemente presentados en publicaciones recientes como supuestos "avances del estado del arte", no reflejan ninguna superioridad algorítmica. Son, por el contrario, el síntoma evidente de que el modelo ha evaluado copias sintéticas exactas que ya había internalizado durante su fase de entrenamiento, beneficiándose además del sesgo de anticipación (</w:t>
-      </w:r>
-      <w:r>
-        <w:rPr>
-          <w:rFonts w:ascii="Arial" w:hAnsi="Arial"/>
-          <w:i/>
-          <w:iCs/>
-          <w:lang w:eastAsia="es-ES"/>
-        </w:rPr>
-        <w:t>look-ahead bias</w:t>
-      </w:r>
-      <w:r>
-        <w:rPr>
-          <w:rFonts w:ascii="Arial" w:hAnsi="Arial"/>
-          <w:lang w:eastAsia="es-ES"/>
-        </w:rPr>
-        <w:t>) al usar eventos futuros para predecir el pasado.</w:t>
-      </w:r>
-    </w:p>
-    <w:p>
-      <w:pPr>
-        <w:pStyle w:val="Ttulo3"/>
-        <w:spacing w:line="240" w:lineRule="auto"/>
-        <w:rPr>
-          <w:rFonts w:ascii="Arial" w:hAnsi="Arial"/>
-        </w:rPr>
-      </w:pPr>
-      <w:bookmarkStart w:id="55" w:name="_Toc224752865"/>
-      <w:r>
-        <w:rPr>
-          <w:rFonts w:ascii="Arial" w:hAnsi="Arial"/>
-        </w:rPr>
-        <w:t>Evaluación bajo Metodología Estricta (La Realidad)</w:t>
-      </w:r>
-      <w:bookmarkEnd w:id="55"/>
-    </w:p>
-    <w:p>
-      <w:pPr>
-        <w:spacing w:line="240" w:lineRule="auto"/>
-        <w:rPr>
-          <w:rFonts w:ascii="Arial" w:hAnsi="Arial"/>
-          <w:lang w:eastAsia="es-ES"/>
-        </w:rPr>
-      </w:pPr>
-      <w:r>
-        <w:rPr>
-          <w:rFonts w:ascii="Arial" w:hAnsi="Arial"/>
-          <w:lang w:eastAsia="es-ES"/>
-        </w:rPr>
-        <w:t>En contraposición, la rama Correcta implementó el protocolo de aislamiento estricto exigido para entornos financieros. La partición se realizó respetando la cronología temporal de las transacciones (validación prequencial), y cualquier transformación de los datos se encapsuló exclusivamente dentro del pliegue de entrenamiento (</w:t>
-      </w:r>
-      <w:r>
-        <w:rPr>
-          <w:rFonts w:ascii="Arial" w:hAnsi="Arial"/>
-          <w:i/>
-          <w:iCs/>
-          <w:lang w:eastAsia="es-ES"/>
-        </w:rPr>
-        <w:t>Train</w:t>
-      </w:r>
-      <w:r>
-        <w:rPr>
-          <w:rFonts w:ascii="Arial" w:hAnsi="Arial"/>
-          <w:lang w:eastAsia="es-ES"/>
-        </w:rPr>
-        <w:t>), evaluándose sobre un conjunto de prueba completamente inalterado.</w:t>
-      </w:r>
-    </w:p>
-    <w:p>
-      <w:pPr>
-        <w:spacing w:line="240" w:lineRule="auto"/>
-        <w:rPr>
-          <w:rFonts w:ascii="Arial" w:hAnsi="Arial"/>
-          <w:lang w:eastAsia="es-ES"/>
-        </w:rPr>
-      </w:pPr>
-      <w:r>
-        <w:rPr>
-          <w:rFonts w:ascii="Arial" w:hAnsi="Arial"/>
-          <w:lang w:eastAsia="es-ES"/>
-        </w:rPr>
-        <w:t>Privados de la fuga de información, el rendimiento real y honesto de los algoritmos sufrió una penalización drástica. La Regresión Logística descendió a un AUPRC de 0.5830, Random Forest se situó en 0.6115 y XGBoost alcanzó un 0.6163. Esta degradación refleja la verdadera capacidad de generalización de los modelos ante vectores de fraude inéditos, subrayando la extrema dificultad del problema una vez eliminado el espejismo metodológico.</w:t>
-      </w:r>
-    </w:p>
-    <w:p>
-      <w:pPr>
-        <w:pStyle w:val="Ttulo3"/>
-        <w:spacing w:line="240" w:lineRule="auto"/>
-        <w:rPr>
-          <w:rFonts w:ascii="Arial" w:hAnsi="Arial"/>
-        </w:rPr>
-      </w:pPr>
-      <w:bookmarkStart w:id="56" w:name="_Toc224752866"/>
-      <w:r>
-        <w:rPr>
-          <w:rFonts w:ascii="Arial" w:hAnsi="Arial"/>
-        </w:rPr>
-        <w:t>Cuantificación de la Divergencia Algorítmica (</w:t>
-      </w:r>
-      <w:r>
-        <w:rPr>
-          <w:rFonts w:ascii="Arial" w:hAnsi="Arial"/>
-        </w:rPr>
-        <w:t>Δ</w:t>
-      </w:r>
-      <w:r>
-        <w:rPr>
-          <w:rFonts w:ascii="Arial" w:hAnsi="Arial"/>
-        </w:rPr>
-        <w:t>)</w:t>
-      </w:r>
-      <w:bookmarkEnd w:id="56"/>
-    </w:p>
-    <w:p>
-      <w:pPr>
-        <w:spacing w:line="240" w:lineRule="auto"/>
-        <w:rPr>
-          <w:rFonts w:ascii="Arial" w:hAnsi="Arial"/>
-          <w:lang w:eastAsia="es-ES"/>
-        </w:rPr>
-      </w:pPr>
-      <w:r>
-        <w:rPr>
-          <w:rFonts w:ascii="Arial" w:hAnsi="Arial"/>
-          <w:lang w:eastAsia="es-ES"/>
-        </w:rPr>
-        <w:t xml:space="preserve">Para identificar qué defecto metodológico genera mayor contaminación, se aislaron las tres fuentes de fuga de datos de forma independiente. La </w:t>
-      </w:r>
-      <w:r>
-        <w:rPr>
-          <w:rFonts w:ascii="Arial" w:hAnsi="Arial"/>
-          <w:lang w:eastAsia="es-ES"/>
-        </w:rPr>
-        <w:t>siguiente tabla</w:t>
-      </w:r>
-      <w:r>
-        <w:rPr>
-          <w:rFonts w:ascii="Arial" w:hAnsi="Arial"/>
-          <w:lang w:eastAsia="es-ES"/>
-        </w:rPr>
-        <w:t xml:space="preserve"> y la </w:t>
-      </w:r>
-      <w:r>
-        <w:rPr>
-          <w:rFonts w:ascii="Arial" w:hAnsi="Arial"/>
-          <w:lang w:eastAsia="es-ES"/>
-        </w:rPr>
-        <w:t>figura</w:t>
-      </w:r>
-      <w:r>
-        <w:rPr>
-          <w:rFonts w:ascii="Arial" w:hAnsi="Arial"/>
-          <w:lang w:eastAsia="es-ES"/>
-        </w:rPr>
-        <w:t xml:space="preserve"> muestran el desglose del incremento marginal (inflación) en la métrica AUPRC respecto al rendimiento base honesto.</w:t>
-      </w:r>
-    </w:p>
-    <w:p>
-      <w:pPr>
-        <w:spacing w:line="240" w:lineRule="auto"/>
-        <w:rPr>
-          <w:rFonts w:ascii="Arial" w:hAnsi="Arial"/>
-          <w:lang w:eastAsia="es-ES"/>
-        </w:rPr>
-      </w:pPr>
-      <w:r>
-        <w:rPr>
-          <w:rFonts w:ascii="Arial" w:hAnsi="Arial"/>
-          <w:b/>
-          <w:bCs/>
+        <w:jc w:val="center"/>
+        <w:rPr>
+          <w:rFonts w:ascii="Arial" w:hAnsi="Arial"/>
+          <w:lang w:eastAsia="es-ES"/>
+        </w:rPr>
+      </w:pPr>
+      <w:r>
+        <w:rPr>
           <w:noProof/>
-          <w:lang w:eastAsia="es-ES"/>
         </w:rPr>
         <w:lastRenderedPageBreak/>
         <w:drawing>
-          <wp:inline distT="0" distB="0" distL="0" distR="0" wp14:anchorId="3C611D66" wp14:editId="0179EA9D">
-            <wp:extent cx="5400040" cy="1786890"/>
-            <wp:effectExtent l="0" t="0" r="0" b="3810"/>
-            <wp:docPr id="1393853306" name="Imagen 1" descr="Gráfico, Gráfico de barras&#10;&#10;El contenido generado por IA puede ser incorrecto."/>
+          <wp:inline distT="0" distB="0" distL="0" distR="0" wp14:anchorId="10BCFD7C" wp14:editId="0CB18303">
+            <wp:extent cx="4914900" cy="6969518"/>
+            <wp:effectExtent l="0" t="0" r="0" b="3175"/>
+            <wp:docPr id="633611104" name="Imagen 5" descr="Figure 1"/>
             <wp:cNvGraphicFramePr>
               <a:graphicFrameLocks xmlns:a="http://schemas.openxmlformats.org/drawingml/2006/main" noChangeAspect="1"/>
             </wp:cNvGraphicFramePr>
@@ -18007,11 +18110,268 @@
               <a:graphicData uri="http://schemas.openxmlformats.org/drawingml/2006/picture">
                 <pic:pic xmlns:pic="http://schemas.openxmlformats.org/drawingml/2006/picture">
                   <pic:nvPicPr>
-                    <pic:cNvPr id="1393853306" name="Imagen 1" descr="Gráfico, Gráfico de barras&#10;&#10;El contenido generado por IA puede ser incorrecto."/>
+                    <pic:cNvPr id="0" name="Picture 13" descr="Figure 1"/>
+                    <pic:cNvPicPr>
+                      <a:picLocks noChangeAspect="1" noChangeArrowheads="1"/>
+                    </pic:cNvPicPr>
+                  </pic:nvPicPr>
+                  <pic:blipFill>
+                    <a:blip r:embed="rId26">
+                      <a:extLst>
+                        <a:ext uri="{28A0092B-C50C-407E-A947-70E740481C1C}">
+                          <a14:useLocalDpi xmlns:a14="http://schemas.microsoft.com/office/drawing/2010/main" val="0"/>
+                        </a:ext>
+                      </a:extLst>
+                    </a:blip>
+                    <a:srcRect/>
+                    <a:stretch>
+                      <a:fillRect/>
+                    </a:stretch>
+                  </pic:blipFill>
+                  <pic:spPr bwMode="auto">
+                    <a:xfrm>
+                      <a:off x="0" y="0"/>
+                      <a:ext cx="4916837" cy="6972265"/>
+                    </a:xfrm>
+                    <a:prstGeom prst="rect">
+                      <a:avLst/>
+                    </a:prstGeom>
+                    <a:noFill/>
+                    <a:ln>
+                      <a:noFill/>
+                    </a:ln>
+                  </pic:spPr>
+                </pic:pic>
+              </a:graphicData>
+            </a:graphic>
+          </wp:inline>
+        </w:drawing>
+      </w:r>
+    </w:p>
+    <w:p>
+      <w:pPr>
+        <w:spacing w:line="240" w:lineRule="auto"/>
+        <w:rPr>
+          <w:rFonts w:ascii="Arial" w:hAnsi="Arial"/>
+          <w:lang w:eastAsia="es-ES"/>
+        </w:rPr>
+      </w:pPr>
+      <w:r>
+        <w:rPr>
+          <w:rFonts w:ascii="Arial" w:hAnsi="Arial"/>
+          <w:lang w:eastAsia="es-ES"/>
+        </w:rPr>
+        <w:t>Bajo estas condiciones de contaminación extrema, los algoritmos reportaron métricas ilusoriamente perfectas. La Regresión Logística alcanzó un AUPRC de 0.9287, mientras que los modelos de conjunto lograron memorizar el patrón por completo: Random Forest registró un AUPRC de 0.9999 y XGBoost un 0.9995. Adicionalmente, los valores de AUC ROC rozaron el 1.0 en los modelos de árboles.</w:t>
+      </w:r>
+    </w:p>
+    <w:p>
+      <w:pPr>
+        <w:spacing w:line="240" w:lineRule="auto"/>
+        <w:rPr>
+          <w:rFonts w:ascii="Arial" w:hAnsi="Arial"/>
+          <w:lang w:eastAsia="es-ES"/>
+        </w:rPr>
+      </w:pPr>
+      <w:r>
+        <w:rPr>
+          <w:rFonts w:ascii="Arial" w:hAnsi="Arial"/>
+          <w:lang w:eastAsia="es-ES"/>
+        </w:rPr>
+        <w:t xml:space="preserve">Estos resultados, frecuentemente presentados en publicaciones recientes como supuestos "avances del estado del arte", no reflejan ninguna superioridad algorítmica. Son, por el contrario, el síntoma evidente de que el modelo ha evaluado copias sintéticas </w:t>
+      </w:r>
+      <w:r>
+        <w:rPr>
+          <w:rFonts w:ascii="Arial" w:hAnsi="Arial"/>
+          <w:lang w:eastAsia="es-ES"/>
+        </w:rPr>
+        <w:lastRenderedPageBreak/>
+        <w:t>exactas que ya había internalizado durante su fase de entrenamiento, beneficiándose además del sesgo de anticipación (</w:t>
+      </w:r>
+      <w:r>
+        <w:rPr>
+          <w:rFonts w:ascii="Arial" w:hAnsi="Arial"/>
+          <w:i/>
+          <w:iCs/>
+          <w:lang w:eastAsia="es-ES"/>
+        </w:rPr>
+        <w:t>look-ahead bias</w:t>
+      </w:r>
+      <w:r>
+        <w:rPr>
+          <w:rFonts w:ascii="Arial" w:hAnsi="Arial"/>
+          <w:lang w:eastAsia="es-ES"/>
+        </w:rPr>
+        <w:t>) al usar eventos futuros para predecir el pasado.</w:t>
+      </w:r>
+    </w:p>
+    <w:p>
+      <w:pPr>
+        <w:pStyle w:val="Ttulo3"/>
+        <w:spacing w:line="240" w:lineRule="auto"/>
+        <w:rPr>
+          <w:rFonts w:ascii="Arial" w:hAnsi="Arial"/>
+        </w:rPr>
+      </w:pPr>
+      <w:bookmarkStart w:id="55" w:name="_Toc224752865"/>
+      <w:r>
+        <w:rPr>
+          <w:rFonts w:ascii="Arial" w:hAnsi="Arial"/>
+        </w:rPr>
+        <w:t>Evaluación bajo Metodología Estricta (La Realidad)</w:t>
+      </w:r>
+      <w:bookmarkEnd w:id="55"/>
+    </w:p>
+    <w:p>
+      <w:pPr>
+        <w:spacing w:line="240" w:lineRule="auto"/>
+        <w:rPr>
+          <w:rFonts w:ascii="Arial" w:hAnsi="Arial"/>
+          <w:lang w:eastAsia="es-ES"/>
+        </w:rPr>
+      </w:pPr>
+      <w:r>
+        <w:rPr>
+          <w:rFonts w:ascii="Arial" w:hAnsi="Arial"/>
+          <w:lang w:eastAsia="es-ES"/>
+        </w:rPr>
+        <w:t>En contraposición, la rama Correcta implementó el protocolo de aislamiento estricto exigido para entornos financieros. La partición se realizó respetando la cronología temporal de las transacciones (validación prequencial), y cualquier transformación de los datos se encapsuló exclusivamente dentro del pliegue de entrenamiento (</w:t>
+      </w:r>
+      <w:r>
+        <w:rPr>
+          <w:rFonts w:ascii="Arial" w:hAnsi="Arial"/>
+          <w:i/>
+          <w:iCs/>
+          <w:lang w:eastAsia="es-ES"/>
+        </w:rPr>
+        <w:t>Train</w:t>
+      </w:r>
+      <w:r>
+        <w:rPr>
+          <w:rFonts w:ascii="Arial" w:hAnsi="Arial"/>
+          <w:lang w:eastAsia="es-ES"/>
+        </w:rPr>
+        <w:t>), evaluándose sobre un conjunto de prueba completamente inalterado.</w:t>
+      </w:r>
+    </w:p>
+    <w:p>
+      <w:pPr>
+        <w:spacing w:line="240" w:lineRule="auto"/>
+        <w:rPr>
+          <w:rFonts w:ascii="Arial" w:hAnsi="Arial"/>
+          <w:lang w:eastAsia="es-ES"/>
+        </w:rPr>
+      </w:pPr>
+      <w:r>
+        <w:rPr>
+          <w:rFonts w:ascii="Arial" w:hAnsi="Arial"/>
+          <w:lang w:eastAsia="es-ES"/>
+        </w:rPr>
+        <w:t>Privados de la fuga de información, el rendimiento real y honesto de los algoritmos sufrió una penalización drástica. La Regresión Logística descendió a un AUPRC de 0.5830, Random Forest se situó en 0.6115 y XGBoost alcanzó un 0.6163. Esta degradación refleja la verdadera capacidad de generalización de los modelos ante vectores de fraude inéditos, subrayando la extrema dificultad del problema una vez eliminado el espejismo metodológico.</w:t>
+      </w:r>
+    </w:p>
+    <w:p>
+      <w:pPr>
+        <w:pStyle w:val="Ttulo3"/>
+        <w:spacing w:line="240" w:lineRule="auto"/>
+        <w:rPr>
+          <w:rFonts w:ascii="Arial" w:hAnsi="Arial"/>
+        </w:rPr>
+      </w:pPr>
+      <w:bookmarkStart w:id="56" w:name="_Toc224752866"/>
+      <w:r>
+        <w:rPr>
+          <w:rFonts w:ascii="Arial" w:hAnsi="Arial"/>
+        </w:rPr>
+        <w:t>Cuantificación de la Divergencia Algorítmica (</w:t>
+      </w:r>
+      <w:r>
+        <w:rPr>
+          <w:rFonts w:ascii="Arial" w:hAnsi="Arial"/>
+        </w:rPr>
+        <w:t>Δ</w:t>
+      </w:r>
+      <w:r>
+        <w:rPr>
+          <w:rFonts w:ascii="Arial" w:hAnsi="Arial"/>
+        </w:rPr>
+        <w:t>)</w:t>
+      </w:r>
+      <w:bookmarkEnd w:id="56"/>
+    </w:p>
+    <w:p>
+      <w:pPr>
+        <w:spacing w:line="240" w:lineRule="auto"/>
+        <w:rPr>
+          <w:rFonts w:ascii="Arial" w:hAnsi="Arial"/>
+          <w:lang w:eastAsia="es-ES"/>
+        </w:rPr>
+      </w:pPr>
+      <w:r>
+        <w:rPr>
+          <w:rFonts w:ascii="Arial" w:hAnsi="Arial"/>
+          <w:lang w:eastAsia="es-ES"/>
+        </w:rPr>
+        <w:t xml:space="preserve">Para identificar qué defecto metodológico genera mayor contaminación, se aislaron las tres fuentes de fuga de datos de forma independiente. La </w:t>
+      </w:r>
+      <w:r>
+        <w:rPr>
+          <w:rFonts w:ascii="Arial" w:hAnsi="Arial"/>
+          <w:lang w:eastAsia="es-ES"/>
+        </w:rPr>
+        <w:t>siguiente tabla</w:t>
+      </w:r>
+      <w:r>
+        <w:rPr>
+          <w:rFonts w:ascii="Arial" w:hAnsi="Arial"/>
+          <w:lang w:eastAsia="es-ES"/>
+        </w:rPr>
+        <w:t xml:space="preserve"> y la </w:t>
+      </w:r>
+      <w:r>
+        <w:rPr>
+          <w:rFonts w:ascii="Arial" w:hAnsi="Arial"/>
+          <w:lang w:eastAsia="es-ES"/>
+        </w:rPr>
+        <w:t>figura</w:t>
+      </w:r>
+      <w:r>
+        <w:rPr>
+          <w:rFonts w:ascii="Arial" w:hAnsi="Arial"/>
+          <w:lang w:eastAsia="es-ES"/>
+        </w:rPr>
+        <w:t xml:space="preserve"> muestran el desglose del incremento marginal (inflación) en la métrica AUPRC respecto al rendimiento base honesto.</w:t>
+      </w:r>
+    </w:p>
+    <w:p>
+      <w:pPr>
+        <w:spacing w:line="240" w:lineRule="auto"/>
+        <w:rPr>
+          <w:rFonts w:ascii="Arial" w:hAnsi="Arial"/>
+          <w:lang w:eastAsia="es-ES"/>
+        </w:rPr>
+      </w:pPr>
+      <w:r>
+        <w:rPr>
+          <w:rFonts w:ascii="Arial" w:hAnsi="Arial"/>
+          <w:lang w:eastAsia="es-ES"/>
+        </w:rPr>
+        <w:drawing>
+          <wp:inline distT="0" distB="0" distL="0" distR="0" wp14:anchorId="669EE507" wp14:editId="0AF61576">
+            <wp:extent cx="5400040" cy="1786890"/>
+            <wp:effectExtent l="0" t="0" r="0" b="3810"/>
+            <wp:docPr id="2095484287" name="Imagen 1"/>
+            <wp:cNvGraphicFramePr>
+              <a:graphicFrameLocks xmlns:a="http://schemas.openxmlformats.org/drawingml/2006/main" noChangeAspect="1"/>
+            </wp:cNvGraphicFramePr>
+            <a:graphic xmlns:a="http://schemas.openxmlformats.org/drawingml/2006/main">
+              <a:graphicData uri="http://schemas.openxmlformats.org/drawingml/2006/picture">
+                <pic:pic xmlns:pic="http://schemas.openxmlformats.org/drawingml/2006/picture">
+                  <pic:nvPicPr>
+                    <pic:cNvPr id="2095484287" name=""/>
                     <pic:cNvPicPr/>
                   </pic:nvPicPr>
                   <pic:blipFill>
-                    <a:blip r:embed="rId18"/>
+                    <a:blip r:embed="rId27"/>
                     <a:stretch>
                       <a:fillRect/>
                     </a:stretch>
@@ -18864,15 +19224,7 @@
           <w:rFonts w:ascii="Arial" w:hAnsi="Arial"/>
           <w:lang w:eastAsia="es-ES"/>
         </w:rPr>
-        <w:t xml:space="preserve">), creando la ilusión matemática del éxito. Este hallazgo constituye la principal </w:t>
-      </w:r>
-      <w:r>
-        <w:rPr>
-          <w:rFonts w:ascii="Arial" w:hAnsi="Arial"/>
-          <w:lang w:eastAsia="es-ES"/>
-        </w:rPr>
-        <w:lastRenderedPageBreak/>
-        <w:t>evidencia del Trabajo Fin de Máster para sostener que cualquier propuesta en la literatura que reporte valores de Precisión y Recall próximos al 99% sobre este simulador sin detallar explícitamente sus mecanismos de aislamiento temporal, debe ser sometida a estricto escrutinio o descartada por invalidez metodológica.</w:t>
+        <w:t>), creando la ilusión matemática del éxito. Este hallazgo constituye la principal evidencia del Trabajo Fin de Máster para sostener que cualquier propuesta en la literatura que reporte valores de Precisión y Recall próximos al 99% sobre este simulador sin detallar explícitamente sus mecanismos de aislamiento temporal, debe ser sometida a estricto escrutinio o descartada por invalidez metodológica.</w:t>
       </w:r>
     </w:p>
     <w:p>
@@ -19681,7 +20033,6 @@
           <w:noProof/>
           <w:lang w:eastAsia="es-ES"/>
         </w:rPr>
-        <w:lastRenderedPageBreak/>
         <w:drawing>
           <wp:inline distT="0" distB="0" distL="0" distR="0" wp14:anchorId="1425C581" wp14:editId="0239383C">
             <wp:extent cx="5400040" cy="3173095"/>
@@ -19698,7 +20049,7 @@
                     <pic:cNvPicPr/>
                   </pic:nvPicPr>
                   <pic:blipFill>
-                    <a:blip r:embed="rId19"/>
+                    <a:blip r:embed="rId28"/>
                     <a:stretch>
                       <a:fillRect/>
                     </a:stretch>
@@ -19765,7 +20116,15 @@
           <w:rFonts w:ascii="Arial" w:hAnsi="Arial"/>
           <w:lang w:eastAsia="es-ES"/>
         </w:rPr>
-        <w:t>Aunque la métrica nativa resulta útil, es estática y no proporciona información sobre la direccionalidad del impacto. Para superarlo, se aplicó la Teoría de Juegos mediante la librería SHAP (</w:t>
+        <w:t xml:space="preserve">Aunque la métrica nativa resulta útil, es estática y no proporciona información sobre la direccionalidad del impacto. Para superarlo, se aplicó la Teoría de Juegos mediante la </w:t>
+      </w:r>
+      <w:r>
+        <w:rPr>
+          <w:rFonts w:ascii="Arial" w:hAnsi="Arial"/>
+          <w:lang w:eastAsia="es-ES"/>
+        </w:rPr>
+        <w:lastRenderedPageBreak/>
+        <w:t>librería SHAP (</w:t>
       </w:r>
       <w:r>
         <w:rPr>
@@ -19792,6 +20151,15 @@
           <w:lang w:eastAsia="es-ES"/>
         </w:rPr>
       </w:pPr>
+    </w:p>
+    <w:p>
+      <w:pPr>
+        <w:spacing w:line="240" w:lineRule="auto"/>
+        <w:rPr>
+          <w:rFonts w:ascii="Arial" w:hAnsi="Arial"/>
+          <w:lang w:eastAsia="es-ES"/>
+        </w:rPr>
+      </w:pPr>
       <w:r>
         <w:rPr>
           <w:rFonts w:ascii="Arial" w:hAnsi="Arial"/>
@@ -19819,25 +20187,26 @@
     <w:p>
       <w:pPr>
         <w:spacing w:line="240" w:lineRule="auto"/>
-        <w:rPr>
-          <w:rFonts w:ascii="Arial" w:hAnsi="Arial"/>
-          <w:lang w:eastAsia="es-ES"/>
-        </w:rPr>
-      </w:pPr>
-      <w:r>
+        <w:jc w:val="center"/>
         <w:rPr>
           <w:rFonts w:ascii="Arial" w:hAnsi="Arial"/>
           <w:b/>
           <w:bCs/>
-          <w:noProof/>
-          <w:lang w:eastAsia="es-ES"/>
-        </w:rPr>
-        <w:lastRenderedPageBreak/>
+          <w:lang w:eastAsia="es-ES"/>
+        </w:rPr>
+      </w:pPr>
+      <w:r>
+        <w:rPr>
+          <w:rFonts w:ascii="Arial" w:hAnsi="Arial"/>
+          <w:b/>
+          <w:bCs/>
+          <w:lang w:eastAsia="es-ES"/>
+        </w:rPr>
         <w:drawing>
-          <wp:inline distT="0" distB="0" distL="0" distR="0" wp14:anchorId="03F4704F" wp14:editId="2DD91183">
-            <wp:extent cx="5400040" cy="4786630"/>
-            <wp:effectExtent l="0" t="0" r="0" b="0"/>
-            <wp:docPr id="165338637" name="Imagen 1" descr="Texto&#10;&#10;El contenido generado por IA puede ser incorrecto."/>
+          <wp:inline distT="0" distB="0" distL="0" distR="0" wp14:anchorId="4DA3C7AD" wp14:editId="2F7A71BD">
+            <wp:extent cx="4174671" cy="2607697"/>
+            <wp:effectExtent l="0" t="0" r="0" b="2540"/>
+            <wp:docPr id="1716904661" name="Imagen 1"/>
             <wp:cNvGraphicFramePr>
               <a:graphicFrameLocks xmlns:a="http://schemas.openxmlformats.org/drawingml/2006/main" noChangeAspect="1"/>
             </wp:cNvGraphicFramePr>
@@ -19845,11 +20214,11 @@
               <a:graphicData uri="http://schemas.openxmlformats.org/drawingml/2006/picture">
                 <pic:pic xmlns:pic="http://schemas.openxmlformats.org/drawingml/2006/picture">
                   <pic:nvPicPr>
-                    <pic:cNvPr id="165338637" name="Imagen 1" descr="Texto&#10;&#10;El contenido generado por IA puede ser incorrecto."/>
+                    <pic:cNvPr id="1716904661" name=""/>
                     <pic:cNvPicPr/>
                   </pic:nvPicPr>
                   <pic:blipFill>
-                    <a:blip r:embed="rId20"/>
+                    <a:blip r:embed="rId29"/>
                     <a:stretch>
                       <a:fillRect/>
                     </a:stretch>
@@ -19857,7 +20226,7 @@
                   <pic:spPr>
                     <a:xfrm>
                       <a:off x="0" y="0"/>
-                      <a:ext cx="5400040" cy="4786630"/>
+                      <a:ext cx="4182557" cy="2612623"/>
                     </a:xfrm>
                     <a:prstGeom prst="rect">
                       <a:avLst/>
@@ -19869,15 +20238,15 @@
           </wp:inline>
         </w:drawing>
       </w:r>
-      <w:r>
-        <w:rPr>
-          <w:rFonts w:ascii="Arial" w:hAnsi="Arial"/>
-          <w:b/>
-          <w:bCs/>
-          <w:lang w:eastAsia="es-ES"/>
-        </w:rPr>
-        <w:t xml:space="preserve"> </w:t>
-      </w:r>
+    </w:p>
+    <w:p>
+      <w:pPr>
+        <w:spacing w:line="240" w:lineRule="auto"/>
+        <w:rPr>
+          <w:rFonts w:ascii="Arial" w:hAnsi="Arial"/>
+          <w:lang w:eastAsia="es-ES"/>
+        </w:rPr>
+      </w:pPr>
       <w:r>
         <w:rPr>
           <w:rFonts w:ascii="Arial" w:hAnsi="Arial"/>
@@ -19949,6 +20318,63 @@
           <w:lang w:eastAsia="es-ES"/>
         </w:rPr>
         <w:t>) para justificar el bloqueo preventivo de una tarjeta específica.</w:t>
+      </w:r>
+    </w:p>
+    <w:p>
+      <w:pPr>
+        <w:spacing w:line="240" w:lineRule="auto"/>
+        <w:jc w:val="center"/>
+        <w:rPr>
+          <w:rFonts w:ascii="Arial" w:hAnsi="Arial"/>
+          <w:lang w:eastAsia="es-ES"/>
+        </w:rPr>
+      </w:pPr>
+      <w:r>
+        <w:rPr>
+          <w:noProof/>
+        </w:rPr>
+        <w:lastRenderedPageBreak/>
+        <w:drawing>
+          <wp:inline distT="0" distB="0" distL="0" distR="0" wp14:anchorId="6C7391AC" wp14:editId="4AFE52B7">
+            <wp:extent cx="4659086" cy="3564441"/>
+            <wp:effectExtent l="0" t="0" r="8255" b="0"/>
+            <wp:docPr id="916671775" name="Gráfico 1"/>
+            <wp:cNvGraphicFramePr>
+              <a:graphicFrameLocks xmlns:a="http://schemas.openxmlformats.org/drawingml/2006/main" noChangeAspect="1"/>
+            </wp:cNvGraphicFramePr>
+            <a:graphic xmlns:a="http://schemas.openxmlformats.org/drawingml/2006/main">
+              <a:graphicData uri="http://schemas.openxmlformats.org/drawingml/2006/picture">
+                <pic:pic xmlns:pic="http://schemas.openxmlformats.org/drawingml/2006/picture">
+                  <pic:nvPicPr>
+                    <pic:cNvPr id="916671775" name=""/>
+                    <pic:cNvPicPr/>
+                  </pic:nvPicPr>
+                  <pic:blipFill>
+                    <a:blip r:embed="rId30">
+                      <a:extLst>
+                        <a:ext uri="{96DAC541-7B7A-43D3-8B79-37D633B846F1}">
+                          <asvg:svgBlip xmlns:asvg="http://schemas.microsoft.com/office/drawing/2016/SVG/main" r:embed="rId31"/>
+                        </a:ext>
+                      </a:extLst>
+                    </a:blip>
+                    <a:stretch>
+                      <a:fillRect/>
+                    </a:stretch>
+                  </pic:blipFill>
+                  <pic:spPr>
+                    <a:xfrm>
+                      <a:off x="0" y="0"/>
+                      <a:ext cx="4702691" cy="3597801"/>
+                    </a:xfrm>
+                    <a:prstGeom prst="rect">
+                      <a:avLst/>
+                    </a:prstGeom>
+                  </pic:spPr>
+                </pic:pic>
+              </a:graphicData>
+            </a:graphic>
+          </wp:inline>
+        </w:drawing>
       </w:r>
     </w:p>
     <w:p>
@@ -19999,7 +20425,6 @@
           <w:noProof/>
           <w:lang w:eastAsia="es-ES"/>
         </w:rPr>
-        <w:lastRenderedPageBreak/>
         <w:drawing>
           <wp:inline distT="0" distB="0" distL="0" distR="0" wp14:anchorId="3A168B00" wp14:editId="06908E83">
             <wp:extent cx="5400040" cy="1550670"/>
@@ -20016,7 +20441,7 @@
                     <pic:cNvPicPr/>
                   </pic:nvPicPr>
                   <pic:blipFill>
-                    <a:blip r:embed="rId21"/>
+                    <a:blip r:embed="rId32"/>
                     <a:stretch>
                       <a:fillRect/>
                     </a:stretch>
@@ -20069,7 +20494,7 @@
                     <pic:cNvPicPr/>
                   </pic:nvPicPr>
                   <pic:blipFill>
-                    <a:blip r:embed="rId22"/>
+                    <a:blip r:embed="rId33"/>
                     <a:stretch>
                       <a:fillRect/>
                     </a:stretch>
@@ -20103,7 +20528,15 @@
           <w:rFonts w:ascii="Arial" w:hAnsi="Arial"/>
           <w:lang w:eastAsia="es-ES"/>
         </w:rPr>
-        <w:t>La observación de la Figura 4.6 permite reconstruir la narrativa matemática de una alarma. El algoritmo no emitió el bloqueo por puro azar, sino porque identificó un incremento simultáneo en factores de riesgo determinantes: un alto monto combinado con una coincidencia en un terminal catalogado como de alto riesgo en la ventana de 7 días. Por el contrario, en operaciones legítimas (Figura 4.7), un historial de gasto predecible y la ausencia de alertas recientes en el comercio actúan como fuerzas estabilizadoras.</w:t>
+        <w:t xml:space="preserve">La observación de la Figura 4.6 permite reconstruir la narrativa matemática de una alarma. El algoritmo no emitió el bloqueo por puro azar, sino porque identificó un incremento simultáneo en factores de riesgo determinantes: un alto monto combinado con una coincidencia en un terminal catalogado como de alto riesgo en la ventana de 7 días. Por el contrario, en operaciones legítimas (Figura 4.7), un historial de gasto </w:t>
+      </w:r>
+      <w:r>
+        <w:rPr>
+          <w:rFonts w:ascii="Arial" w:hAnsi="Arial"/>
+          <w:lang w:eastAsia="es-ES"/>
+        </w:rPr>
+        <w:lastRenderedPageBreak/>
+        <w:t>predecible y la ausencia de alertas recientes en el comercio actúan como fuerzas estabilizadoras.</w:t>
       </w:r>
     </w:p>
     <w:p>
@@ -20500,7 +20933,6 @@
                 <w:rFonts w:ascii="Arial" w:hAnsi="Arial"/>
                 <w:lang w:eastAsia="es-ES"/>
               </w:rPr>
-              <w:lastRenderedPageBreak/>
               <w:t>Diferencial ($\Delta$)</w:t>
             </w:r>
           </w:p>
@@ -20638,6 +21070,7 @@
           <w:noProof/>
           <w:lang w:eastAsia="es-ES"/>
         </w:rPr>
+        <w:lastRenderedPageBreak/>
         <w:drawing>
           <wp:anchor distT="0" distB="0" distL="114300" distR="114300" simplePos="0" relativeHeight="251659264" behindDoc="0" locked="0" layoutInCell="1" allowOverlap="1" wp14:anchorId="737DD6DE" wp14:editId="5157EEE7">
             <wp:simplePos x="0" y="0"/>
@@ -20662,7 +21095,7 @@
                     <pic:cNvPicPr/>
                   </pic:nvPicPr>
                   <pic:blipFill>
-                    <a:blip r:embed="rId23" cstate="print">
+                    <a:blip r:embed="rId34" cstate="print">
                       <a:extLst>
                         <a:ext uri="{28A0092B-C50C-407E-A947-70E740481C1C}">
                           <a14:useLocalDpi xmlns:a14="http://schemas.microsoft.com/office/drawing/2010/main" val="0"/>
@@ -20718,7 +21151,7 @@
                     <pic:cNvPicPr/>
                   </pic:nvPicPr>
                   <pic:blipFill>
-                    <a:blip r:embed="rId24" cstate="print">
+                    <a:blip r:embed="rId35" cstate="print">
                       <a:extLst>
                         <a:ext uri="{28A0092B-C50C-407E-A947-70E740481C1C}">
                           <a14:useLocalDpi xmlns:a14="http://schemas.microsoft.com/office/drawing/2010/main" val="0"/>
@@ -20808,7 +21241,6 @@
         <w:rPr>
           <w:rFonts w:ascii="Arial" w:hAnsi="Arial"/>
         </w:rPr>
-        <w:lastRenderedPageBreak/>
         <w:br w:type="page"/>
       </w:r>
     </w:p>
@@ -22146,7 +22578,7 @@
         </w:rPr>
         <w:t xml:space="preserve">, 487-492. </w:t>
       </w:r>
-      <w:hyperlink r:id="rId25" w:tgtFrame="_blank" w:history="1">
+      <w:hyperlink r:id="rId36" w:tgtFrame="_blank" w:history="1">
         <w:r>
           <w:rPr>
             <w:rStyle w:val="Hipervnculo"/>
@@ -22166,6 +22598,7 @@
           <w:rFonts w:ascii="Arial" w:hAnsi="Arial" w:cs="Arial"/>
           <w:sz w:val="22"/>
           <w:szCs w:val="22"/>
+          <w:lang w:val="es-ES"/>
         </w:rPr>
       </w:pPr>
       <w:r>
@@ -22173,8 +22606,9 @@
           <w:rFonts w:ascii="Arial" w:hAnsi="Arial" w:cs="Arial"/>
           <w:sz w:val="22"/>
           <w:szCs w:val="22"/>
-        </w:rPr>
-        <w:t xml:space="preserve">Asha, R. B., &amp; Suresh Kumar, K. R. (2021). Credit card fraud detection using artificial neural network. </w:t>
+          <w:lang w:val="es-ES"/>
+        </w:rPr>
+        <w:t xml:space="preserve">Agrahari, S., Srivastava, S., &amp; Singh, A. K. (2023). Review on novelty detection in the non-stationary environment. </w:t>
       </w:r>
       <w:r>
         <w:rPr>
@@ -22183,26 +22617,49 @@
           <w:iCs/>
           <w:sz w:val="22"/>
           <w:szCs w:val="22"/>
-        </w:rPr>
-        <w:t>Global Transitions Proceedings</w:t>
+          <w:lang w:val="es-ES"/>
+        </w:rPr>
+        <w:t>Knowledge and Information Systems</w:t>
       </w:r>
       <w:r>
         <w:rPr>
           <w:rFonts w:ascii="Arial" w:hAnsi="Arial" w:cs="Arial"/>
           <w:sz w:val="22"/>
           <w:szCs w:val="22"/>
-        </w:rPr>
-        <w:t xml:space="preserve">, 2(1), 35-41. </w:t>
-      </w:r>
-      <w:hyperlink r:id="rId26" w:tgtFrame="_blank" w:history="1">
+          <w:lang w:val="es-ES"/>
+        </w:rPr>
+        <w:t xml:space="preserve">, </w:t>
+      </w:r>
+      <w:r>
+        <w:rPr>
+          <w:rFonts w:ascii="Arial" w:hAnsi="Arial" w:cs="Arial"/>
+          <w:i/>
+          <w:iCs/>
+          <w:sz w:val="22"/>
+          <w:szCs w:val="22"/>
+          <w:lang w:val="es-ES"/>
+        </w:rPr>
+        <w:t>65</w:t>
+      </w:r>
+      <w:r>
+        <w:rPr>
+          <w:rFonts w:ascii="Arial" w:hAnsi="Arial" w:cs="Arial"/>
+          <w:sz w:val="22"/>
+          <w:szCs w:val="22"/>
+          <w:lang w:val="es-ES"/>
+        </w:rPr>
+        <w:t xml:space="preserve">(3), 1549–1574. </w:t>
+      </w:r>
+      <w:hyperlink r:id="rId37" w:tgtFrame="_blank" w:history="1">
         <w:r>
           <w:rPr>
             <w:rStyle w:val="Hipervnculo"/>
             <w:rFonts w:ascii="Arial" w:hAnsi="Arial" w:cs="Arial"/>
             <w:sz w:val="22"/>
             <w:szCs w:val="22"/>
+            <w:lang w:val="es-ES"/>
           </w:rPr>
-          <w:t>https://doi.org/10.1016/j.gltp.2021.01.006</w:t>
+          <w:t>https://doi.org/10.1007/s10115-023-02018-x</w:t>
         </w:r>
       </w:hyperlink>
     </w:p>
@@ -22279,7 +22736,7 @@
         </w:rPr>
         <w:t xml:space="preserve">, No. 816. </w:t>
       </w:r>
-      <w:hyperlink r:id="rId27" w:tgtFrame="_blank" w:history="1">
+      <w:hyperlink r:id="rId38" w:tgtFrame="_blank" w:history="1">
         <w:r>
           <w:rPr>
             <w:rStyle w:val="Hipervnculo"/>
@@ -22327,7 +22784,7 @@
         </w:rPr>
         <w:t xml:space="preserve">, 45(1), 5-32. </w:t>
       </w:r>
-      <w:hyperlink r:id="rId28" w:tgtFrame="_blank" w:history="1">
+      <w:hyperlink r:id="rId39" w:tgtFrame="_blank" w:history="1">
         <w:r>
           <w:rPr>
             <w:rStyle w:val="Hipervnculo"/>
@@ -22375,7 +22832,7 @@
         </w:rPr>
         <w:t xml:space="preserve">, 73(1), 70-90. </w:t>
       </w:r>
-      <w:hyperlink r:id="rId29" w:tgtFrame="_blank" w:history="1">
+      <w:hyperlink r:id="rId40" w:tgtFrame="_blank" w:history="1">
         <w:r>
           <w:rPr>
             <w:rStyle w:val="Hipervnculo"/>
@@ -22423,7 +22880,7 @@
         </w:rPr>
         <w:t xml:space="preserve">, 557, 317-331. </w:t>
       </w:r>
-      <w:hyperlink r:id="rId30" w:tgtFrame="_blank" w:history="1">
+      <w:hyperlink r:id="rId41" w:tgtFrame="_blank" w:history="1">
         <w:r>
           <w:rPr>
             <w:rStyle w:val="Hipervnculo"/>
@@ -22471,7 +22928,7 @@
         </w:rPr>
         <w:t xml:space="preserve">, 41(3), 1-58. </w:t>
       </w:r>
-      <w:hyperlink r:id="rId31" w:tgtFrame="_blank" w:history="1">
+      <w:hyperlink r:id="rId42" w:tgtFrame="_blank" w:history="1">
         <w:r>
           <w:rPr>
             <w:rStyle w:val="Hipervnculo"/>
@@ -22519,7 +22976,7 @@
         </w:rPr>
         <w:t xml:space="preserve">, 16, 321-357. </w:t>
       </w:r>
-      <w:hyperlink r:id="rId32" w:tgtFrame="_blank" w:history="1">
+      <w:hyperlink r:id="rId43" w:tgtFrame="_blank" w:history="1">
         <w:r>
           <w:rPr>
             <w:rStyle w:val="Hipervnculo"/>
@@ -22567,7 +23024,7 @@
         </w:rPr>
         <w:t xml:space="preserve">, 785-794. </w:t>
       </w:r>
-      <w:hyperlink r:id="rId33" w:tgtFrame="_blank" w:history="1">
+      <w:hyperlink r:id="rId44" w:tgtFrame="_blank" w:history="1">
         <w:r>
           <w:rPr>
             <w:rStyle w:val="Hipervnculo"/>
@@ -22615,7 +23072,7 @@
         </w:rPr>
         <w:t xml:space="preserve">, 51, 134-142. </w:t>
       </w:r>
-      <w:hyperlink r:id="rId34" w:tgtFrame="_blank" w:history="1">
+      <w:hyperlink r:id="rId45" w:tgtFrame="_blank" w:history="1">
         <w:r>
           <w:rPr>
             <w:rStyle w:val="Hipervnculo"/>
@@ -22663,7 +23120,7 @@
         </w:rPr>
         <w:t xml:space="preserve">, 42(19), 6609-6619. </w:t>
       </w:r>
-      <w:hyperlink r:id="rId35" w:tgtFrame="_blank" w:history="1">
+      <w:hyperlink r:id="rId46" w:tgtFrame="_blank" w:history="1">
         <w:r>
           <w:rPr>
             <w:rStyle w:val="Hipervnculo"/>
@@ -22712,7 +23169,7 @@
         </w:rPr>
         <w:t xml:space="preserve">, 41(10), 4915-4928. </w:t>
       </w:r>
-      <w:hyperlink r:id="rId36" w:tgtFrame="_blank" w:history="1">
+      <w:hyperlink r:id="rId47" w:tgtFrame="_blank" w:history="1">
         <w:r>
           <w:rPr>
             <w:rStyle w:val="Hipervnculo"/>
@@ -22760,7 +23217,7 @@
         </w:rPr>
         <w:t xml:space="preserve">, 159-166. </w:t>
       </w:r>
-      <w:hyperlink r:id="rId37" w:tgtFrame="_blank" w:history="1">
+      <w:hyperlink r:id="rId48" w:tgtFrame="_blank" w:history="1">
         <w:r>
           <w:rPr>
             <w:rStyle w:val="Hipervnculo"/>
@@ -22780,43 +23237,7 @@
           <w:rFonts w:ascii="Arial" w:hAnsi="Arial" w:cs="Arial"/>
           <w:sz w:val="22"/>
           <w:szCs w:val="22"/>
-        </w:rPr>
-      </w:pPr>
-      <w:r>
-        <w:rPr>
-          <w:rFonts w:ascii="Arial" w:hAnsi="Arial" w:cs="Arial"/>
-          <w:sz w:val="22"/>
-          <w:szCs w:val="22"/>
-        </w:rPr>
-        <w:t xml:space="preserve">Elkan, C. (2001). The foundations of cost-sensitive learning. </w:t>
-      </w:r>
-      <w:r>
-        <w:rPr>
-          <w:rFonts w:ascii="Arial" w:hAnsi="Arial" w:cs="Arial"/>
-          <w:i/>
-          <w:iCs/>
-          <w:sz w:val="22"/>
-          <w:szCs w:val="22"/>
-        </w:rPr>
-        <w:t>International Joint Conference on Artificial Intelligence (IJCAI)</w:t>
-      </w:r>
-      <w:r>
-        <w:rPr>
-          <w:rFonts w:ascii="Arial" w:hAnsi="Arial" w:cs="Arial"/>
-          <w:sz w:val="22"/>
-          <w:szCs w:val="22"/>
-        </w:rPr>
-        <w:t>, 17, 973-978.</w:t>
-      </w:r>
-    </w:p>
-    <w:p>
-      <w:pPr>
-        <w:pStyle w:val="NormalWeb"/>
-        <w:ind w:left="709" w:hanging="709"/>
-        <w:rPr>
-          <w:rFonts w:ascii="Arial" w:hAnsi="Arial" w:cs="Arial"/>
-          <w:sz w:val="22"/>
-          <w:szCs w:val="22"/>
+          <w:lang w:val="es-ES"/>
         </w:rPr>
       </w:pPr>
       <w:r>
@@ -22826,7 +23247,7 @@
           <w:szCs w:val="22"/>
           <w:lang w:val="es-ES"/>
         </w:rPr>
-        <w:t xml:space="preserve">Esghir, M., Jilal, A., &amp; Elomri, A. (2025). Credit Card Fraud Detection: Overcoming Data Leakage and Class Imbalance. </w:t>
+        <w:t xml:space="preserve">Demircioğlu, A. (2024). Applying oversampling before cross-validation will lead to high bias in radiomics. </w:t>
       </w:r>
       <w:r>
         <w:rPr>
@@ -22837,7 +23258,7 @@
           <w:szCs w:val="22"/>
           <w:lang w:val="es-ES"/>
         </w:rPr>
-        <w:t>IEEE Transactions on Information Forensics and Security</w:t>
+        <w:t>Scientific Reports</w:t>
       </w:r>
       <w:r>
         <w:rPr>
@@ -22846,9 +23267,81 @@
           <w:szCs w:val="22"/>
           <w:lang w:val="es-ES"/>
         </w:rPr>
+        <w:t xml:space="preserve">, </w:t>
+      </w:r>
+      <w:r>
+        <w:rPr>
+          <w:rFonts w:ascii="Arial" w:hAnsi="Arial" w:cs="Arial"/>
+          <w:i/>
+          <w:iCs/>
+          <w:sz w:val="22"/>
+          <w:szCs w:val="22"/>
+          <w:lang w:val="es-ES"/>
+        </w:rPr>
+        <w:t>14</w:t>
+      </w:r>
+      <w:r>
+        <w:rPr>
+          <w:rFonts w:ascii="Arial" w:hAnsi="Arial" w:cs="Arial"/>
+          <w:sz w:val="22"/>
+          <w:szCs w:val="22"/>
+          <w:lang w:val="es-ES"/>
+        </w:rPr>
+        <w:t xml:space="preserve">(1), 11563. </w:t>
+      </w:r>
+      <w:hyperlink r:id="rId49" w:tgtFrame="_blank" w:history="1">
+        <w:r>
+          <w:rPr>
+            <w:rStyle w:val="Hipervnculo"/>
+            <w:rFonts w:ascii="Arial" w:hAnsi="Arial" w:cs="Arial"/>
+            <w:sz w:val="22"/>
+            <w:szCs w:val="22"/>
+            <w:lang w:val="es-ES"/>
+          </w:rPr>
+          <w:t>https://doi.org/10.1038/s41598-024-62585-z</w:t>
+        </w:r>
+      </w:hyperlink>
+    </w:p>
+    <w:p>
+      <w:pPr>
+        <w:pStyle w:val="NormalWeb"/>
+        <w:ind w:left="709" w:hanging="709"/>
+        <w:rPr>
+          <w:rFonts w:ascii="Arial" w:hAnsi="Arial" w:cs="Arial"/>
+          <w:sz w:val="22"/>
+          <w:szCs w:val="22"/>
+        </w:rPr>
+      </w:pPr>
+      <w:r>
+        <w:rPr>
+          <w:rFonts w:ascii="Arial" w:hAnsi="Arial" w:cs="Arial"/>
+          <w:sz w:val="22"/>
+          <w:szCs w:val="22"/>
+          <w:lang w:val="es-ES"/>
+        </w:rPr>
+        <w:t xml:space="preserve">Esghir, M., Jilal, A., &amp; Elomri, A. (2025). Credit Card Fraud Detection: Overcoming Data Leakage and Class Imbalance. </w:t>
+      </w:r>
+      <w:r>
+        <w:rPr>
+          <w:rFonts w:ascii="Arial" w:hAnsi="Arial" w:cs="Arial"/>
+          <w:i/>
+          <w:iCs/>
+          <w:sz w:val="22"/>
+          <w:szCs w:val="22"/>
+          <w:lang w:val="es-ES"/>
+        </w:rPr>
+        <w:t>IEEE Transactions on Information Forensics and Security</w:t>
+      </w:r>
+      <w:r>
+        <w:rPr>
+          <w:rFonts w:ascii="Arial" w:hAnsi="Arial" w:cs="Arial"/>
+          <w:sz w:val="22"/>
+          <w:szCs w:val="22"/>
+          <w:lang w:val="es-ES"/>
+        </w:rPr>
         <w:t xml:space="preserve">, 20, 112-125. </w:t>
       </w:r>
-      <w:hyperlink r:id="rId38" w:tgtFrame="_blank" w:history="1">
+      <w:hyperlink r:id="rId50" w:tgtFrame="_blank" w:history="1">
         <w:r>
           <w:rPr>
             <w:rStyle w:val="Hipervnculo"/>
@@ -22897,7 +23390,7 @@
         </w:rPr>
         <w:t xml:space="preserve">, 61, 863-905. </w:t>
       </w:r>
-      <w:hyperlink r:id="rId39" w:tgtFrame="_blank" w:history="1">
+      <w:hyperlink r:id="rId51" w:tgtFrame="_blank" w:history="1">
         <w:r>
           <w:rPr>
             <w:rStyle w:val="Hipervnculo"/>
@@ -22945,7 +23438,7 @@
         </w:rPr>
         <w:t xml:space="preserve">, 479, 448-455. </w:t>
       </w:r>
-      <w:hyperlink r:id="rId40" w:tgtFrame="_blank" w:history="1">
+      <w:hyperlink r:id="rId52" w:tgtFrame="_blank" w:history="1">
         <w:r>
           <w:rPr>
             <w:rStyle w:val="Hipervnculo"/>
@@ -22993,7 +23486,7 @@
         </w:rPr>
         <w:t xml:space="preserve">, 46(4), 1-37. </w:t>
       </w:r>
-      <w:hyperlink r:id="rId41" w:tgtFrame="_blank" w:history="1">
+      <w:hyperlink r:id="rId53" w:tgtFrame="_blank" w:history="1">
         <w:r>
           <w:rPr>
             <w:rStyle w:val="Hipervnculo"/>
@@ -23078,7 +23571,7 @@
         </w:rPr>
         <w:t xml:space="preserve">, 3(1). </w:t>
       </w:r>
-      <w:hyperlink r:id="rId42" w:tgtFrame="_blank" w:history="1">
+      <w:hyperlink r:id="rId54" w:tgtFrame="_blank" w:history="1">
         <w:r>
           <w:rPr>
             <w:rStyle w:val="Hipervnculo"/>
@@ -23126,7 +23619,7 @@
         </w:rPr>
         <w:t xml:space="preserve">, 25(1). </w:t>
       </w:r>
-      <w:hyperlink r:id="rId43" w:tgtFrame="_blank" w:history="1">
+      <w:hyperlink r:id="rId55" w:tgtFrame="_blank" w:history="1">
         <w:r>
           <w:rPr>
             <w:rStyle w:val="Hipervnculo"/>
@@ -23174,7 +23667,7 @@
         </w:rPr>
         <w:t xml:space="preserve">, 13(16), 2563. </w:t>
       </w:r>
-      <w:hyperlink r:id="rId44" w:tgtFrame="_blank" w:history="1">
+      <w:hyperlink r:id="rId56" w:tgtFrame="_blank" w:history="1">
         <w:r>
           <w:rPr>
             <w:rStyle w:val="Hipervnculo"/>
@@ -23223,7 +23716,7 @@
         </w:rPr>
         <w:t xml:space="preserve">, 21(9), 1263-1284. </w:t>
       </w:r>
-      <w:hyperlink r:id="rId45" w:tgtFrame="_blank" w:history="1">
+      <w:hyperlink r:id="rId57" w:tgtFrame="_blank" w:history="1">
         <w:r>
           <w:rPr>
             <w:rStyle w:val="Hipervnculo"/>
@@ -23243,6 +23736,7 @@
           <w:rFonts w:ascii="Arial" w:hAnsi="Arial" w:cs="Arial"/>
           <w:sz w:val="22"/>
           <w:szCs w:val="22"/>
+          <w:lang w:val="es-ES"/>
         </w:rPr>
       </w:pPr>
       <w:r>
@@ -23250,8 +23744,9 @@
           <w:rFonts w:ascii="Arial" w:hAnsi="Arial" w:cs="Arial"/>
           <w:sz w:val="22"/>
           <w:szCs w:val="22"/>
-        </w:rPr>
-        <w:t xml:space="preserve">Ileberi, E., Sun, Y., &amp; Wang, Z. (2021). Performance Evaluation of Machine Learning Methods for Credit Card Fraud Detection Using SMOTE and AdaBoost. </w:t>
+          <w:lang w:val="es-ES"/>
+        </w:rPr>
+        <w:t xml:space="preserve">Hyndman, R. J., &amp; Athanasopoulos, G. (2021). </w:t>
       </w:r>
       <w:r>
         <w:rPr>
@@ -23260,18 +23755,69 @@
           <w:iCs/>
           <w:sz w:val="22"/>
           <w:szCs w:val="22"/>
-        </w:rPr>
-        <w:t>IEEE Access</w:t>
+          <w:lang w:val="es-ES"/>
+        </w:rPr>
+        <w:t>Forecasting: Principles and practice</w:t>
       </w:r>
       <w:r>
         <w:rPr>
           <w:rFonts w:ascii="Arial" w:hAnsi="Arial" w:cs="Arial"/>
           <w:sz w:val="22"/>
           <w:szCs w:val="22"/>
+          <w:lang w:val="es-ES"/>
+        </w:rPr>
+        <w:t xml:space="preserve"> (3rd ed.). OTexts. </w:t>
+      </w:r>
+      <w:hyperlink r:id="rId58" w:tgtFrame="_blank" w:history="1">
+        <w:r>
+          <w:rPr>
+            <w:rStyle w:val="Hipervnculo"/>
+            <w:rFonts w:ascii="Arial" w:hAnsi="Arial" w:cs="Arial"/>
+            <w:sz w:val="22"/>
+            <w:szCs w:val="22"/>
+            <w:lang w:val="es-ES"/>
+          </w:rPr>
+          <w:t>https://otexts.com/fpp3/</w:t>
+        </w:r>
+      </w:hyperlink>
+    </w:p>
+    <w:p>
+      <w:pPr>
+        <w:pStyle w:val="NormalWeb"/>
+        <w:ind w:left="709" w:hanging="709"/>
+        <w:rPr>
+          <w:rFonts w:ascii="Arial" w:hAnsi="Arial" w:cs="Arial"/>
+          <w:sz w:val="22"/>
+          <w:szCs w:val="22"/>
+        </w:rPr>
+      </w:pPr>
+      <w:r>
+        <w:rPr>
+          <w:rFonts w:ascii="Arial" w:hAnsi="Arial" w:cs="Arial"/>
+          <w:sz w:val="22"/>
+          <w:szCs w:val="22"/>
+        </w:rPr>
+        <w:t xml:space="preserve">Ileberi, E., Sun, Y., &amp; Wang, Z. (2021). Performance Evaluation of Machine Learning Methods for Credit Card Fraud Detection Using SMOTE and AdaBoost. </w:t>
+      </w:r>
+      <w:r>
+        <w:rPr>
+          <w:rFonts w:ascii="Arial" w:hAnsi="Arial" w:cs="Arial"/>
+          <w:i/>
+          <w:iCs/>
+          <w:sz w:val="22"/>
+          <w:szCs w:val="22"/>
+        </w:rPr>
+        <w:t>IEEE Access</w:t>
+      </w:r>
+      <w:r>
+        <w:rPr>
+          <w:rFonts w:ascii="Arial" w:hAnsi="Arial" w:cs="Arial"/>
+          <w:sz w:val="22"/>
+          <w:szCs w:val="22"/>
         </w:rPr>
         <w:t xml:space="preserve">, 9, 165286-165294. </w:t>
       </w:r>
-      <w:hyperlink r:id="rId46" w:tgtFrame="_blank" w:history="1">
+      <w:hyperlink r:id="rId59" w:tgtFrame="_blank" w:history="1">
         <w:r>
           <w:rPr>
             <w:rStyle w:val="Hipervnculo"/>
@@ -23319,7 +23865,7 @@
         </w:rPr>
         <w:t xml:space="preserve">. </w:t>
       </w:r>
-      <w:hyperlink r:id="rId47" w:tgtFrame="_blank" w:history="1">
+      <w:hyperlink r:id="rId60" w:tgtFrame="_blank" w:history="1">
         <w:r>
           <w:rPr>
             <w:rStyle w:val="Hipervnculo"/>
@@ -23367,7 +23913,7 @@
         </w:rPr>
         <w:t xml:space="preserve">. </w:t>
       </w:r>
-      <w:hyperlink r:id="rId48" w:tgtFrame="_blank" w:history="1">
+      <w:hyperlink r:id="rId61" w:tgtFrame="_blank" w:history="1">
         <w:r>
           <w:rPr>
             <w:rStyle w:val="Hipervnculo"/>
@@ -23415,7 +23961,7 @@
         </w:rPr>
         <w:t xml:space="preserve">. </w:t>
       </w:r>
-      <w:hyperlink r:id="rId49" w:tgtFrame="_blank" w:history="1">
+      <w:hyperlink r:id="rId62" w:tgtFrame="_blank" w:history="1">
         <w:r>
           <w:rPr>
             <w:rStyle w:val="Hipervnculo"/>
@@ -23463,7 +24009,7 @@
         </w:rPr>
         <w:t xml:space="preserve">, 195, 105650. </w:t>
       </w:r>
-      <w:hyperlink r:id="rId50" w:tgtFrame="_blank" w:history="1">
+      <w:hyperlink r:id="rId63" w:tgtFrame="_blank" w:history="1">
         <w:r>
           <w:rPr>
             <w:rStyle w:val="Hipervnculo"/>
@@ -23548,7 +24094,7 @@
         </w:rPr>
         <w:t xml:space="preserve">, 7, 93010-93022. </w:t>
       </w:r>
-      <w:hyperlink r:id="rId51" w:tgtFrame="_blank" w:history="1">
+      <w:hyperlink r:id="rId64" w:tgtFrame="_blank" w:history="1">
         <w:r>
           <w:rPr>
             <w:rStyle w:val="Hipervnculo"/>
@@ -23596,7 +24142,7 @@
         </w:rPr>
         <w:t xml:space="preserve"> (2nd ed.). </w:t>
       </w:r>
-      <w:hyperlink r:id="rId52" w:tgtFrame="_blank" w:history="1">
+      <w:hyperlink r:id="rId65" w:tgtFrame="_blank" w:history="1">
         <w:r>
           <w:rPr>
             <w:rStyle w:val="Hipervnculo"/>
@@ -23718,7 +24264,7 @@
         </w:rPr>
         <w:t xml:space="preserve">, 10(3), e0118432. </w:t>
       </w:r>
-      <w:hyperlink r:id="rId53" w:tgtFrame="_blank" w:history="1">
+      <w:hyperlink r:id="rId66" w:tgtFrame="_blank" w:history="1">
         <w:r>
           <w:rPr>
             <w:rStyle w:val="Hipervnculo"/>
@@ -23746,6 +24292,7 @@
           <w:sz w:val="22"/>
           <w:szCs w:val="22"/>
         </w:rPr>
+        <w:lastRenderedPageBreak/>
         <w:t xml:space="preserve">Shanaa, M. (2025). Credit Card Fraud Detection using Explainable AI Methods. </w:t>
       </w:r>
       <w:r>
@@ -23783,7 +24330,6 @@
           <w:sz w:val="22"/>
           <w:szCs w:val="22"/>
         </w:rPr>
-        <w:lastRenderedPageBreak/>
         <w:t xml:space="preserve">Taha, A. A., &amp; Malebary, S. J. (2020). An intelligent approach to credit card fraud detection using an optimized light gradient boosting machine. </w:t>
       </w:r>
       <w:r>
@@ -23804,7 +24350,7 @@
         </w:rPr>
         <w:t xml:space="preserve">, 8, 25579-25587. </w:t>
       </w:r>
-      <w:hyperlink r:id="rId54" w:tgtFrame="_blank" w:history="1">
+      <w:hyperlink r:id="rId67" w:tgtFrame="_blank" w:history="1">
         <w:r>
           <w:rPr>
             <w:rStyle w:val="Hipervnculo"/>
@@ -23852,7 +24398,7 @@
         </w:rPr>
         <w:t xml:space="preserve"> (Issue 1298). Recuperado de </w:t>
       </w:r>
-      <w:hyperlink r:id="rId55" w:tgtFrame="_blank" w:history="1">
+      <w:hyperlink r:id="rId68" w:tgtFrame="_blank" w:history="1">
         <w:r>
           <w:rPr>
             <w:rStyle w:val="Hipervnculo"/>
@@ -23934,10 +24480,10 @@
       </w:pPr>
     </w:p>
     <w:sectPr>
-      <w:headerReference w:type="even" r:id="rId56"/>
-      <w:headerReference w:type="default" r:id="rId57"/>
-      <w:footerReference w:type="even" r:id="rId58"/>
-      <w:footerReference w:type="default" r:id="rId59"/>
+      <w:headerReference w:type="even" r:id="rId69"/>
+      <w:headerReference w:type="default" r:id="rId70"/>
+      <w:footerReference w:type="even" r:id="rId71"/>
+      <w:footerReference w:type="default" r:id="rId72"/>
       <w:pgSz w:w="11906" w:h="16838"/>
       <w:pgMar w:top="2153" w:right="1701" w:bottom="1244" w:left="1701" w:header="708" w:footer="708" w:gutter="0"/>
       <w:cols w:space="720"/>

</xml_diff>